<commit_message>
Update Master Profile: add Matrix 5 (complete) + 6/7/9/10 (June 5 2026)
</commit_message>
<xml_diff>
--- a/Master_Neuro_Semantic_Profile_Samuel_Russell_June5_2026.docx
+++ b/Master_Neuro_Semantic_Profile_Samuel_Russell_June5_2026.docx
@@ -70,7 +70,7 @@
         <w:t xml:space="preserve">only from verbatim answers you supplied</w:t>
       </w:r>
       <w:r>
-        <w:t xml:space="preserve"> — the live dictation of Matrices 1–5 plus a focused 15-question disambiguation batch. Because both instruments are stored as questions-only on GitHub (verified: 0 answer-lines), this dictation is the single source of real data; it is mapped across both architectures (Part 5). It deliberately does </w:t>
+        <w:t xml:space="preserve"> — the live dictation of Matrices 1–7, 9 and 10 plus a focused 15-question disambiguation batch. Because both instruments are stored as questions-only on GitHub (verified: 0 answer-lines), this dictation is the single source of real data; it is mapped across both architectures (Part 5). It deliberately does </w:t>
       </w:r>
       <w:r>
         <w:rPr>
@@ -102,7 +102,7 @@
         <w:t xml:space="preserve">OPEN</w:t>
       </w:r>
       <w:r>
-        <w:t xml:space="preserve"> (still dark or unbound).</w:t>
+        <w:t xml:space="preserve"> (still dark or unbound). This edition incorporates the second dictation batch — completing Matrix 5 and adding Matrices 6 (Chrono-Kinematics), 7 (Relational/Power), 9 (Self) and 10 (State Optimization).</w:t>
       </w:r>
     </w:p>
     <w:p>
@@ -5509,7 +5509,7 @@
           <w:iCs/>
           <w:color w:val="7A7974"/>
         </w:rPr>
-        <w:t xml:space="preserve">States about states — the deepest and most valuable layer.</w:t>
+        <w:t xml:space="preserve">States about states — the deepest and most valuable layer. Now complete.</w:t>
       </w:r>
     </w:p>
     <w:tbl>
@@ -6038,7 +6038,7 @@
                 <w:b/>
                 <w:bCs/>
               </w:rPr>
-              <w:t xml:space="preserve">Forbidden state (origin)</w:t>
+              <w:t xml:space="preserve">Inner critic</w:t>
             </w:r>
           </w:p>
         </w:tc>
@@ -6067,7 +6067,7 @@
                 <w:b w:val="false"/>
                 <w:bCs w:val="false"/>
               </w:rPr>
-              <w:t xml:space="preserve">Violence</w:t>
+              <w:t xml:space="preserve">A loving coach (2/10)</w:t>
             </w:r>
           </w:p>
         </w:tc>
@@ -6126,7 +6126,7 @@
                 <w:b w:val="false"/>
                 <w:bCs w:val="false"/>
               </w:rPr>
-              <w:t xml:space="preserve">The emotion the household taught was unacceptable to show: "violence."</w:t>
+              <w:t xml:space="preserve">Critic loudness 2/10, can silence it; speaks in first person ("I screwed up") — argues AGAINST internalized external authority; self-praises.</w:t>
             </w:r>
           </w:p>
         </w:tc>
@@ -6157,7 +6157,7 @@
                 <w:b/>
                 <w:bCs/>
               </w:rPr>
-              <w:t xml:space="preserve">Vulnerability frame</w:t>
+              <w:t xml:space="preserve">Success-taboo / imposter</w:t>
             </w:r>
           </w:p>
         </w:tc>
@@ -6186,7 +6186,7 @@
                 <w:b w:val="false"/>
                 <w:bCs w:val="false"/>
               </w:rPr>
-              <w:t xml:space="preserve">Not weakness; observed</w:t>
+              <w:t xml:space="preserve">None</w:t>
             </w:r>
           </w:p>
         </w:tc>
@@ -6245,7 +6245,7 @@
                 <w:b w:val="false"/>
                 <w:bCs w:val="false"/>
               </w:rPr>
-              <w:t xml:space="preserve">Crying/fear "not a sign of weakness"; tends to "observe it" rather than judge it.</w:t>
+              <w:t xml:space="preserve">All "No"; center-of-attention "very comfortable." Zero imposter syndrome.</w:t>
             </w:r>
           </w:p>
         </w:tc>
@@ -6276,6 +6276,601 @@
                 <w:b/>
                 <w:bCs/>
               </w:rPr>
+              <w:t xml:space="preserve">Resilience frame</w:t>
+            </w:r>
+          </w:p>
+        </w:tc>
+        <w:tc>
+          <w:tcPr>
+            <w:tcW w:type="dxa" w:w="2050"/>
+            <w:tcBorders>
+              <w:top w:val="single" w:color="B0B0B0" w:sz="1"/>
+              <w:left w:val="single" w:color="B0B0B0" w:sz="1"/>
+              <w:bottom w:val="single" w:color="B0B0B0" w:sz="1"/>
+              <w:right w:val="single" w:color="B0B0B0" w:sz="1"/>
+            </w:tcBorders>
+            <w:tcMar>
+              <w:top w:type="dxa" w:w="60"/>
+              <w:left w:type="dxa" w:w="100"/>
+              <w:bottom w:type="dxa" w:w="60"/>
+              <w:right w:type="dxa" w:w="100"/>
+            </w:tcMar>
+          </w:tcPr>
+          <w:p>
+            <w:pPr>
+              <w:spacing w:after="0" w:line="256"/>
+            </w:pPr>
+            <w:r>
+              <w:rPr>
+                <w:b w:val="false"/>
+                <w:bCs w:val="false"/>
+              </w:rPr>
+              <w:t xml:space="preserve">Pain as fuel</w:t>
+            </w:r>
+          </w:p>
+        </w:tc>
+        <w:tc>
+          <w:tcPr>
+            <w:tcW w:type="dxa" w:w="1100"/>
+            <w:tcBorders>
+              <w:top w:val="single" w:color="B0B0B0" w:sz="1"/>
+              <w:left w:val="single" w:color="B0B0B0" w:sz="1"/>
+              <w:bottom w:val="single" w:color="B0B0B0" w:sz="1"/>
+              <w:right w:val="single" w:color="B0B0B0" w:sz="1"/>
+            </w:tcBorders>
+            <w:shd w:fill="E8F2E2" w:val="clear"/>
+            <w:tcMar>
+              <w:top w:type="dxa" w:w="60"/>
+              <w:left w:type="dxa" w:w="100"/>
+              <w:bottom w:type="dxa" w:w="60"/>
+              <w:right w:type="dxa" w:w="100"/>
+            </w:tcMar>
+          </w:tcPr>
+          <w:p>
+            <w:pPr>
+              <w:spacing w:after="0" w:line="256"/>
+            </w:pPr>
+            <w:r>
+              <w:rPr>
+                <w:b/>
+                <w:bCs/>
+              </w:rPr>
+              <w:t xml:space="preserve">LOCKED</w:t>
+            </w:r>
+          </w:p>
+        </w:tc>
+        <w:tc>
+          <w:tcPr>
+            <w:tcW w:type="dxa" w:w="3810"/>
+            <w:tcBorders>
+              <w:top w:val="single" w:color="B0B0B0" w:sz="1"/>
+              <w:left w:val="single" w:color="B0B0B0" w:sz="1"/>
+              <w:bottom w:val="single" w:color="B0B0B0" w:sz="1"/>
+              <w:right w:val="single" w:color="B0B0B0" w:sz="1"/>
+            </w:tcBorders>
+            <w:tcMar>
+              <w:top w:type="dxa" w:w="60"/>
+              <w:left w:type="dxa" w:w="100"/>
+              <w:bottom w:type="dxa" w:w="60"/>
+              <w:right w:type="dxa" w:w="100"/>
+            </w:tcMar>
+          </w:tcPr>
+          <w:p>
+            <w:pPr>
+              <w:spacing w:after="0" w:line="256"/>
+            </w:pPr>
+            <w:r>
+              <w:rPr>
+                <w:b w:val="false"/>
+                <w:bCs w:val="false"/>
+              </w:rPr>
+              <w:t xml:space="preserve">Rock-bottom = "raw fuel"; pain = "soul expanding"; heartbreak → "gratitude."</w:t>
+            </w:r>
+          </w:p>
+        </w:tc>
+      </w:tr>
+      <w:tr>
+        <w:tc>
+          <w:tcPr>
+            <w:tcW w:type="dxa" w:w="2400"/>
+            <w:tcBorders>
+              <w:top w:val="single" w:color="B0B0B0" w:sz="1"/>
+              <w:left w:val="single" w:color="B0B0B0" w:sz="1"/>
+              <w:bottom w:val="single" w:color="B0B0B0" w:sz="1"/>
+              <w:right w:val="single" w:color="B0B0B0" w:sz="1"/>
+            </w:tcBorders>
+            <w:tcMar>
+              <w:top w:type="dxa" w:w="60"/>
+              <w:left w:type="dxa" w:w="100"/>
+              <w:bottom w:type="dxa" w:w="60"/>
+              <w:right w:type="dxa" w:w="100"/>
+            </w:tcMar>
+          </w:tcPr>
+          <w:p>
+            <w:pPr>
+              <w:spacing w:after="0" w:line="256"/>
+            </w:pPr>
+            <w:r>
+              <w:rPr>
+                <w:b/>
+                <w:bCs/>
+              </w:rPr>
+              <w:t xml:space="preserve">Mastery frame</w:t>
+            </w:r>
+          </w:p>
+        </w:tc>
+        <w:tc>
+          <w:tcPr>
+            <w:tcW w:type="dxa" w:w="2050"/>
+            <w:tcBorders>
+              <w:top w:val="single" w:color="B0B0B0" w:sz="1"/>
+              <w:left w:val="single" w:color="B0B0B0" w:sz="1"/>
+              <w:bottom w:val="single" w:color="B0B0B0" w:sz="1"/>
+              <w:right w:val="single" w:color="B0B0B0" w:sz="1"/>
+            </w:tcBorders>
+            <w:tcMar>
+              <w:top w:type="dxa" w:w="60"/>
+              <w:left w:type="dxa" w:w="100"/>
+              <w:bottom w:type="dxa" w:w="60"/>
+              <w:right w:type="dxa" w:w="100"/>
+            </w:tcMar>
+          </w:tcPr>
+          <w:p>
+            <w:pPr>
+              <w:spacing w:after="0" w:line="256"/>
+            </w:pPr>
+            <w:r>
+              <w:rPr>
+                <w:b w:val="false"/>
+                <w:bCs w:val="false"/>
+              </w:rPr>
+              <w:t xml:space="preserve">Outcome &gt; daily practice</w:t>
+            </w:r>
+          </w:p>
+        </w:tc>
+        <w:tc>
+          <w:tcPr>
+            <w:tcW w:type="dxa" w:w="1100"/>
+            <w:tcBorders>
+              <w:top w:val="single" w:color="B0B0B0" w:sz="1"/>
+              <w:left w:val="single" w:color="B0B0B0" w:sz="1"/>
+              <w:bottom w:val="single" w:color="B0B0B0" w:sz="1"/>
+              <w:right w:val="single" w:color="B0B0B0" w:sz="1"/>
+            </w:tcBorders>
+            <w:shd w:fill="E8F2E2" w:val="clear"/>
+            <w:tcMar>
+              <w:top w:type="dxa" w:w="60"/>
+              <w:left w:type="dxa" w:w="100"/>
+              <w:bottom w:type="dxa" w:w="60"/>
+              <w:right w:type="dxa" w:w="100"/>
+            </w:tcMar>
+          </w:tcPr>
+          <w:p>
+            <w:pPr>
+              <w:spacing w:after="0" w:line="256"/>
+            </w:pPr>
+            <w:r>
+              <w:rPr>
+                <w:b/>
+                <w:bCs/>
+              </w:rPr>
+              <w:t xml:space="preserve">LOCKED</w:t>
+            </w:r>
+          </w:p>
+        </w:tc>
+        <w:tc>
+          <w:tcPr>
+            <w:tcW w:type="dxa" w:w="3810"/>
+            <w:tcBorders>
+              <w:top w:val="single" w:color="B0B0B0" w:sz="1"/>
+              <w:left w:val="single" w:color="B0B0B0" w:sz="1"/>
+              <w:bottom w:val="single" w:color="B0B0B0" w:sz="1"/>
+              <w:right w:val="single" w:color="B0B0B0" w:sz="1"/>
+            </w:tcBorders>
+            <w:tcMar>
+              <w:top w:type="dxa" w:w="60"/>
+              <w:left w:type="dxa" w:w="100"/>
+              <w:bottom w:type="dxa" w:w="60"/>
+              <w:right w:type="dxa" w:w="100"/>
+            </w:tcMar>
+          </w:tcPr>
+          <w:p>
+            <w:pPr>
+              <w:spacing w:after="0" w:line="256"/>
+            </w:pPr>
+            <w:r>
+              <w:rPr>
+                <w:b w:val="false"/>
+                <w:bCs w:val="false"/>
+              </w:rPr>
+              <w:t xml:space="preserve">Genius "both born + learned"; "I lean in"; "ever-expanding cloud"; values the destination of mastery above the daily grind.</w:t>
+            </w:r>
+          </w:p>
+        </w:tc>
+      </w:tr>
+      <w:tr>
+        <w:tc>
+          <w:tcPr>
+            <w:tcW w:type="dxa" w:w="2400"/>
+            <w:tcBorders>
+              <w:top w:val="single" w:color="B0B0B0" w:sz="1"/>
+              <w:left w:val="single" w:color="B0B0B0" w:sz="1"/>
+              <w:bottom w:val="single" w:color="B0B0B0" w:sz="1"/>
+              <w:right w:val="single" w:color="B0B0B0" w:sz="1"/>
+            </w:tcBorders>
+            <w:tcMar>
+              <w:top w:type="dxa" w:w="60"/>
+              <w:left w:type="dxa" w:w="100"/>
+              <w:bottom w:type="dxa" w:w="60"/>
+              <w:right w:type="dxa" w:w="100"/>
+            </w:tcMar>
+          </w:tcPr>
+          <w:p>
+            <w:pPr>
+              <w:spacing w:after="0" w:line="256"/>
+            </w:pPr>
+            <w:r>
+              <w:rPr>
+                <w:b/>
+                <w:bCs/>
+              </w:rPr>
+              <w:t xml:space="preserve">Mind-lines</w:t>
+            </w:r>
+          </w:p>
+        </w:tc>
+        <w:tc>
+          <w:tcPr>
+            <w:tcW w:type="dxa" w:w="2050"/>
+            <w:tcBorders>
+              <w:top w:val="single" w:color="B0B0B0" w:sz="1"/>
+              <w:left w:val="single" w:color="B0B0B0" w:sz="1"/>
+              <w:bottom w:val="single" w:color="B0B0B0" w:sz="1"/>
+              <w:right w:val="single" w:color="B0B0B0" w:sz="1"/>
+            </w:tcBorders>
+            <w:tcMar>
+              <w:top w:type="dxa" w:w="60"/>
+              <w:left w:type="dxa" w:w="100"/>
+              <w:bottom w:type="dxa" w:w="60"/>
+              <w:right w:type="dxa" w:w="100"/>
+            </w:tcMar>
+          </w:tcPr>
+          <w:p>
+            <w:pPr>
+              <w:spacing w:after="0" w:line="256"/>
+            </w:pPr>
+            <w:r>
+              <w:rPr>
+                <w:b w:val="false"/>
+                <w:bCs w:val="false"/>
+              </w:rPr>
+              <w:t xml:space="preserve">All strong</w:t>
+            </w:r>
+          </w:p>
+        </w:tc>
+        <w:tc>
+          <w:tcPr>
+            <w:tcW w:type="dxa" w:w="1100"/>
+            <w:tcBorders>
+              <w:top w:val="single" w:color="B0B0B0" w:sz="1"/>
+              <w:left w:val="single" w:color="B0B0B0" w:sz="1"/>
+              <w:bottom w:val="single" w:color="B0B0B0" w:sz="1"/>
+              <w:right w:val="single" w:color="B0B0B0" w:sz="1"/>
+            </w:tcBorders>
+            <w:shd w:fill="E8F2E2" w:val="clear"/>
+            <w:tcMar>
+              <w:top w:type="dxa" w:w="60"/>
+              <w:left w:type="dxa" w:w="100"/>
+              <w:bottom w:type="dxa" w:w="60"/>
+              <w:right w:type="dxa" w:w="100"/>
+            </w:tcMar>
+          </w:tcPr>
+          <w:p>
+            <w:pPr>
+              <w:spacing w:after="0" w:line="256"/>
+            </w:pPr>
+            <w:r>
+              <w:rPr>
+                <w:b/>
+                <w:bCs/>
+              </w:rPr>
+              <w:t xml:space="preserve">LOCKED</w:t>
+            </w:r>
+          </w:p>
+        </w:tc>
+        <w:tc>
+          <w:tcPr>
+            <w:tcW w:type="dxa" w:w="3810"/>
+            <w:tcBorders>
+              <w:top w:val="single" w:color="B0B0B0" w:sz="1"/>
+              <w:left w:val="single" w:color="B0B0B0" w:sz="1"/>
+              <w:bottom w:val="single" w:color="B0B0B0" w:sz="1"/>
+              <w:right w:val="single" w:color="B0B0B0" w:sz="1"/>
+            </w:tcBorders>
+            <w:tcMar>
+              <w:top w:type="dxa" w:w="60"/>
+              <w:left w:type="dxa" w:w="100"/>
+              <w:bottom w:type="dxa" w:w="60"/>
+              <w:right w:type="dxa" w:w="100"/>
+            </w:tcMar>
+          </w:tcPr>
+          <w:p>
+            <w:pPr>
+              <w:spacing w:after="0" w:line="256"/>
+            </w:pPr>
+            <w:r>
+              <w:rPr>
+                <w:b w:val="false"/>
+                <w:bCs w:val="false"/>
+              </w:rPr>
+              <w:t xml:space="preserve">Breaks behavior≠meaning; "…yet"; choice-language throughout.</w:t>
+            </w:r>
+          </w:p>
+        </w:tc>
+      </w:tr>
+      <w:tr>
+        <w:tc>
+          <w:tcPr>
+            <w:tcW w:type="dxa" w:w="2400"/>
+            <w:tcBorders>
+              <w:top w:val="single" w:color="B0B0B0" w:sz="1"/>
+              <w:left w:val="single" w:color="B0B0B0" w:sz="1"/>
+              <w:bottom w:val="single" w:color="B0B0B0" w:sz="1"/>
+              <w:right w:val="single" w:color="B0B0B0" w:sz="1"/>
+            </w:tcBorders>
+            <w:tcMar>
+              <w:top w:type="dxa" w:w="60"/>
+              <w:left w:type="dxa" w:w="100"/>
+              <w:bottom w:type="dxa" w:w="60"/>
+              <w:right w:type="dxa" w:w="100"/>
+            </w:tcMar>
+          </w:tcPr>
+          <w:p>
+            <w:pPr>
+              <w:spacing w:after="0" w:line="256"/>
+            </w:pPr>
+            <w:r>
+              <w:rPr>
+                <w:b/>
+                <w:bCs/>
+              </w:rPr>
+              <w:t xml:space="preserve">Forbidden state (origin)</w:t>
+            </w:r>
+          </w:p>
+        </w:tc>
+        <w:tc>
+          <w:tcPr>
+            <w:tcW w:type="dxa" w:w="2050"/>
+            <w:tcBorders>
+              <w:top w:val="single" w:color="B0B0B0" w:sz="1"/>
+              <w:left w:val="single" w:color="B0B0B0" w:sz="1"/>
+              <w:bottom w:val="single" w:color="B0B0B0" w:sz="1"/>
+              <w:right w:val="single" w:color="B0B0B0" w:sz="1"/>
+            </w:tcBorders>
+            <w:tcMar>
+              <w:top w:type="dxa" w:w="60"/>
+              <w:left w:type="dxa" w:w="100"/>
+              <w:bottom w:type="dxa" w:w="60"/>
+              <w:right w:type="dxa" w:w="100"/>
+            </w:tcMar>
+          </w:tcPr>
+          <w:p>
+            <w:pPr>
+              <w:spacing w:after="0" w:line="256"/>
+            </w:pPr>
+            <w:r>
+              <w:rPr>
+                <w:b w:val="false"/>
+                <w:bCs w:val="false"/>
+              </w:rPr>
+              <w:t xml:space="preserve">Violence</w:t>
+            </w:r>
+          </w:p>
+        </w:tc>
+        <w:tc>
+          <w:tcPr>
+            <w:tcW w:type="dxa" w:w="1100"/>
+            <w:tcBorders>
+              <w:top w:val="single" w:color="B0B0B0" w:sz="1"/>
+              <w:left w:val="single" w:color="B0B0B0" w:sz="1"/>
+              <w:bottom w:val="single" w:color="B0B0B0" w:sz="1"/>
+              <w:right w:val="single" w:color="B0B0B0" w:sz="1"/>
+            </w:tcBorders>
+            <w:shd w:fill="E8F2E2" w:val="clear"/>
+            <w:tcMar>
+              <w:top w:type="dxa" w:w="60"/>
+              <w:left w:type="dxa" w:w="100"/>
+              <w:bottom w:type="dxa" w:w="60"/>
+              <w:right w:type="dxa" w:w="100"/>
+            </w:tcMar>
+          </w:tcPr>
+          <w:p>
+            <w:pPr>
+              <w:spacing w:after="0" w:line="256"/>
+            </w:pPr>
+            <w:r>
+              <w:rPr>
+                <w:b/>
+                <w:bCs/>
+              </w:rPr>
+              <w:t xml:space="preserve">LOCKED</w:t>
+            </w:r>
+          </w:p>
+        </w:tc>
+        <w:tc>
+          <w:tcPr>
+            <w:tcW w:type="dxa" w:w="3810"/>
+            <w:tcBorders>
+              <w:top w:val="single" w:color="B0B0B0" w:sz="1"/>
+              <w:left w:val="single" w:color="B0B0B0" w:sz="1"/>
+              <w:bottom w:val="single" w:color="B0B0B0" w:sz="1"/>
+              <w:right w:val="single" w:color="B0B0B0" w:sz="1"/>
+            </w:tcBorders>
+            <w:tcMar>
+              <w:top w:type="dxa" w:w="60"/>
+              <w:left w:type="dxa" w:w="100"/>
+              <w:bottom w:type="dxa" w:w="60"/>
+              <w:right w:type="dxa" w:w="100"/>
+            </w:tcMar>
+          </w:tcPr>
+          <w:p>
+            <w:pPr>
+              <w:spacing w:after="0" w:line="256"/>
+            </w:pPr>
+            <w:r>
+              <w:rPr>
+                <w:b w:val="false"/>
+                <w:bCs w:val="false"/>
+              </w:rPr>
+              <w:t xml:space="preserve">The emotion the household taught was unacceptable to show: "violence."</w:t>
+            </w:r>
+          </w:p>
+        </w:tc>
+      </w:tr>
+      <w:tr>
+        <w:tc>
+          <w:tcPr>
+            <w:tcW w:type="dxa" w:w="2400"/>
+            <w:tcBorders>
+              <w:top w:val="single" w:color="B0B0B0" w:sz="1"/>
+              <w:left w:val="single" w:color="B0B0B0" w:sz="1"/>
+              <w:bottom w:val="single" w:color="B0B0B0" w:sz="1"/>
+              <w:right w:val="single" w:color="B0B0B0" w:sz="1"/>
+            </w:tcBorders>
+            <w:tcMar>
+              <w:top w:type="dxa" w:w="60"/>
+              <w:left w:type="dxa" w:w="100"/>
+              <w:bottom w:type="dxa" w:w="60"/>
+              <w:right w:type="dxa" w:w="100"/>
+            </w:tcMar>
+          </w:tcPr>
+          <w:p>
+            <w:pPr>
+              <w:spacing w:after="0" w:line="256"/>
+            </w:pPr>
+            <w:r>
+              <w:rPr>
+                <w:b/>
+                <w:bCs/>
+              </w:rPr>
+              <w:t xml:space="preserve">Vulnerability frame</w:t>
+            </w:r>
+          </w:p>
+        </w:tc>
+        <w:tc>
+          <w:tcPr>
+            <w:tcW w:type="dxa" w:w="2050"/>
+            <w:tcBorders>
+              <w:top w:val="single" w:color="B0B0B0" w:sz="1"/>
+              <w:left w:val="single" w:color="B0B0B0" w:sz="1"/>
+              <w:bottom w:val="single" w:color="B0B0B0" w:sz="1"/>
+              <w:right w:val="single" w:color="B0B0B0" w:sz="1"/>
+            </w:tcBorders>
+            <w:tcMar>
+              <w:top w:type="dxa" w:w="60"/>
+              <w:left w:type="dxa" w:w="100"/>
+              <w:bottom w:type="dxa" w:w="60"/>
+              <w:right w:type="dxa" w:w="100"/>
+            </w:tcMar>
+          </w:tcPr>
+          <w:p>
+            <w:pPr>
+              <w:spacing w:after="0" w:line="256"/>
+            </w:pPr>
+            <w:r>
+              <w:rPr>
+                <w:b w:val="false"/>
+                <w:bCs w:val="false"/>
+              </w:rPr>
+              <w:t xml:space="preserve">Not weakness; observed</w:t>
+            </w:r>
+          </w:p>
+        </w:tc>
+        <w:tc>
+          <w:tcPr>
+            <w:tcW w:type="dxa" w:w="1100"/>
+            <w:tcBorders>
+              <w:top w:val="single" w:color="B0B0B0" w:sz="1"/>
+              <w:left w:val="single" w:color="B0B0B0" w:sz="1"/>
+              <w:bottom w:val="single" w:color="B0B0B0" w:sz="1"/>
+              <w:right w:val="single" w:color="B0B0B0" w:sz="1"/>
+            </w:tcBorders>
+            <w:shd w:fill="E8F2E2" w:val="clear"/>
+            <w:tcMar>
+              <w:top w:type="dxa" w:w="60"/>
+              <w:left w:type="dxa" w:w="100"/>
+              <w:bottom w:type="dxa" w:w="60"/>
+              <w:right w:type="dxa" w:w="100"/>
+            </w:tcMar>
+          </w:tcPr>
+          <w:p>
+            <w:pPr>
+              <w:spacing w:after="0" w:line="256"/>
+            </w:pPr>
+            <w:r>
+              <w:rPr>
+                <w:b/>
+                <w:bCs/>
+              </w:rPr>
+              <w:t xml:space="preserve">LOCKED</w:t>
+            </w:r>
+          </w:p>
+        </w:tc>
+        <w:tc>
+          <w:tcPr>
+            <w:tcW w:type="dxa" w:w="3810"/>
+            <w:tcBorders>
+              <w:top w:val="single" w:color="B0B0B0" w:sz="1"/>
+              <w:left w:val="single" w:color="B0B0B0" w:sz="1"/>
+              <w:bottom w:val="single" w:color="B0B0B0" w:sz="1"/>
+              <w:right w:val="single" w:color="B0B0B0" w:sz="1"/>
+            </w:tcBorders>
+            <w:tcMar>
+              <w:top w:type="dxa" w:w="60"/>
+              <w:left w:type="dxa" w:w="100"/>
+              <w:bottom w:type="dxa" w:w="60"/>
+              <w:right w:type="dxa" w:w="100"/>
+            </w:tcMar>
+          </w:tcPr>
+          <w:p>
+            <w:pPr>
+              <w:spacing w:after="0" w:line="256"/>
+            </w:pPr>
+            <w:r>
+              <w:rPr>
+                <w:b w:val="false"/>
+                <w:bCs w:val="false"/>
+              </w:rPr>
+              <w:t xml:space="preserve">Crying/fear "not a sign of weakness"; tends to "observe it" rather than judge it.</w:t>
+            </w:r>
+          </w:p>
+        </w:tc>
+      </w:tr>
+      <w:tr>
+        <w:tc>
+          <w:tcPr>
+            <w:tcW w:type="dxa" w:w="2400"/>
+            <w:tcBorders>
+              <w:top w:val="single" w:color="B0B0B0" w:sz="1"/>
+              <w:left w:val="single" w:color="B0B0B0" w:sz="1"/>
+              <w:bottom w:val="single" w:color="B0B0B0" w:sz="1"/>
+              <w:right w:val="single" w:color="B0B0B0" w:sz="1"/>
+            </w:tcBorders>
+            <w:tcMar>
+              <w:top w:type="dxa" w:w="60"/>
+              <w:left w:type="dxa" w:w="100"/>
+              <w:bottom w:type="dxa" w:w="60"/>
+              <w:right w:type="dxa" w:w="100"/>
+            </w:tcMar>
+          </w:tcPr>
+          <w:p>
+            <w:pPr>
+              <w:spacing w:after="0" w:line="256"/>
+            </w:pPr>
+            <w:r>
+              <w:rPr>
+                <w:b/>
+                <w:bCs/>
+              </w:rPr>
               <w:t xml:space="preserve">Being-state trigger</w:t>
             </w:r>
           </w:p>
@@ -6365,6 +6960,2963 @@
                 <w:bCs w:val="false"/>
               </w:rPr>
               <w:t xml:space="preserve">Being = "holding the silence and listening, being present for other people."</w:t>
+            </w:r>
+          </w:p>
+        </w:tc>
+      </w:tr>
+      <w:tr>
+        <w:tc>
+          <w:tcPr>
+            <w:tcW w:type="dxa" w:w="2400"/>
+            <w:tcBorders>
+              <w:top w:val="single" w:color="B0B0B0" w:sz="1"/>
+              <w:left w:val="single" w:color="B0B0B0" w:sz="1"/>
+              <w:bottom w:val="single" w:color="B0B0B0" w:sz="1"/>
+              <w:right w:val="single" w:color="B0B0B0" w:sz="1"/>
+            </w:tcBorders>
+            <w:tcMar>
+              <w:top w:type="dxa" w:w="60"/>
+              <w:left w:type="dxa" w:w="100"/>
+              <w:bottom w:type="dxa" w:w="60"/>
+              <w:right w:type="dxa" w:w="100"/>
+            </w:tcMar>
+          </w:tcPr>
+          <w:p>
+            <w:pPr>
+              <w:spacing w:after="0" w:line="256"/>
+            </w:pPr>
+            <w:r>
+              <w:rPr>
+                <w:b/>
+                <w:bCs/>
+              </w:rPr>
+              <w:t xml:space="preserve">Ultimate WHY</w:t>
+            </w:r>
+          </w:p>
+        </w:tc>
+        <w:tc>
+          <w:tcPr>
+            <w:tcW w:type="dxa" w:w="2050"/>
+            <w:tcBorders>
+              <w:top w:val="single" w:color="B0B0B0" w:sz="1"/>
+              <w:left w:val="single" w:color="B0B0B0" w:sz="1"/>
+              <w:bottom w:val="single" w:color="B0B0B0" w:sz="1"/>
+              <w:right w:val="single" w:color="B0B0B0" w:sz="1"/>
+            </w:tcBorders>
+            <w:tcMar>
+              <w:top w:type="dxa" w:w="60"/>
+              <w:left w:type="dxa" w:w="100"/>
+              <w:bottom w:type="dxa" w:w="60"/>
+              <w:right w:type="dxa" w:w="100"/>
+            </w:tcMar>
+          </w:tcPr>
+          <w:p>
+            <w:pPr>
+              <w:spacing w:after="0" w:line="256"/>
+            </w:pPr>
+            <w:r>
+              <w:rPr>
+                <w:b w:val="false"/>
+                <w:bCs w:val="false"/>
+              </w:rPr>
+              <w:t xml:space="preserve">Freedom → mastery → contribution</w:t>
+            </w:r>
+          </w:p>
+        </w:tc>
+        <w:tc>
+          <w:tcPr>
+            <w:tcW w:type="dxa" w:w="1100"/>
+            <w:tcBorders>
+              <w:top w:val="single" w:color="B0B0B0" w:sz="1"/>
+              <w:left w:val="single" w:color="B0B0B0" w:sz="1"/>
+              <w:bottom w:val="single" w:color="B0B0B0" w:sz="1"/>
+              <w:right w:val="single" w:color="B0B0B0" w:sz="1"/>
+            </w:tcBorders>
+            <w:shd w:fill="E8F2E2" w:val="clear"/>
+            <w:tcMar>
+              <w:top w:type="dxa" w:w="60"/>
+              <w:left w:type="dxa" w:w="100"/>
+              <w:bottom w:type="dxa" w:w="60"/>
+              <w:right w:type="dxa" w:w="100"/>
+            </w:tcMar>
+          </w:tcPr>
+          <w:p>
+            <w:pPr>
+              <w:spacing w:after="0" w:line="256"/>
+            </w:pPr>
+            <w:r>
+              <w:rPr>
+                <w:b/>
+                <w:bCs/>
+              </w:rPr>
+              <w:t xml:space="preserve">LOCKED</w:t>
+            </w:r>
+          </w:p>
+        </w:tc>
+        <w:tc>
+          <w:tcPr>
+            <w:tcW w:type="dxa" w:w="3810"/>
+            <w:tcBorders>
+              <w:top w:val="single" w:color="B0B0B0" w:sz="1"/>
+              <w:left w:val="single" w:color="B0B0B0" w:sz="1"/>
+              <w:bottom w:val="single" w:color="B0B0B0" w:sz="1"/>
+              <w:right w:val="single" w:color="B0B0B0" w:sz="1"/>
+            </w:tcBorders>
+            <w:tcMar>
+              <w:top w:type="dxa" w:w="60"/>
+              <w:left w:type="dxa" w:w="100"/>
+              <w:bottom w:type="dxa" w:w="60"/>
+              <w:right w:type="dxa" w:w="100"/>
+            </w:tcMar>
+          </w:tcPr>
+          <w:p>
+            <w:pPr>
+              <w:spacing w:after="0" w:line="256"/>
+            </w:pPr>
+            <w:r>
+              <w:rPr>
+                <w:b w:val="false"/>
+                <w:bCs w:val="false"/>
+              </w:rPr>
+              <w:t xml:space="preserve">Verbatim: "to be free, to be myself, to have mastery, to love myself, to forgive myself, to contribute, to reduce suffering in others, to see the best in others, to give the best story." Money → chasing FREEDOM.</w:t>
+            </w:r>
+          </w:p>
+        </w:tc>
+      </w:tr>
+    </w:tbl>
+    <w:p>
+      <w:pPr>
+        <w:spacing w:after="160"/>
+      </w:pPr>
+    </w:p>
+    <w:p>
+      <w:pPr>
+        <w:pStyle w:val="Heading2"/>
+        <w:spacing w:after="80" w:before="160"/>
+      </w:pPr>
+      <w:r>
+        <w:rPr>
+          <w:color w:val="20808D"/>
+        </w:rPr>
+        <w:t xml:space="preserve">Matrix 6 — Chrono-Kinematics (Time Coding)</w:t>
+      </w:r>
+    </w:p>
+    <w:p>
+      <w:pPr>
+        <w:spacing w:after="100" w:line="276"/>
+      </w:pPr>
+      <w:r>
+        <w:rPr>
+          <w:i/>
+          <w:iCs/>
+          <w:color w:val="7A7974"/>
+        </w:rPr>
+        <w:t xml:space="preserve">How time is laid out, paced, and survived. New axis, fully captured.</w:t>
+      </w:r>
+    </w:p>
+    <w:tbl>
+      <w:tblPr>
+        <w:tblW w:type="dxa" w:w="9360"/>
+        <w:tblBorders>
+          <w:top w:val="single" w:color="auto" w:sz="4"/>
+          <w:left w:val="single" w:color="auto" w:sz="4"/>
+          <w:bottom w:val="single" w:color="auto" w:sz="4"/>
+          <w:right w:val="single" w:color="auto" w:sz="4"/>
+          <w:insideH w:val="single" w:color="auto" w:sz="4"/>
+          <w:insideV w:val="single" w:color="auto" w:sz="4"/>
+        </w:tblBorders>
+      </w:tblPr>
+      <w:tblGrid>
+        <w:gridCol w:w="2400"/>
+        <w:gridCol w:w="2050"/>
+        <w:gridCol w:w="1100"/>
+        <w:gridCol w:w="3810"/>
+      </w:tblGrid>
+      <w:tr>
+        <w:trPr>
+          <w:tblHeader/>
+        </w:trPr>
+        <w:tc>
+          <w:tcPr>
+            <w:tcW w:type="dxa" w:w="2400"/>
+            <w:tcBorders>
+              <w:top w:val="single" w:color="B0B0B0" w:sz="1"/>
+              <w:left w:val="single" w:color="B0B0B0" w:sz="1"/>
+              <w:bottom w:val="single" w:color="B0B0B0" w:sz="1"/>
+              <w:right w:val="single" w:color="B0B0B0" w:sz="1"/>
+            </w:tcBorders>
+            <w:shd w:fill="D9ECEE" w:val="clear"/>
+            <w:tcMar>
+              <w:top w:type="dxa" w:w="60"/>
+              <w:left w:type="dxa" w:w="100"/>
+              <w:bottom w:type="dxa" w:w="60"/>
+              <w:right w:type="dxa" w:w="100"/>
+            </w:tcMar>
+          </w:tcPr>
+          <w:p>
+            <w:pPr>
+              <w:spacing w:after="0" w:line="256"/>
+            </w:pPr>
+            <w:r>
+              <w:rPr>
+                <w:b/>
+                <w:bCs/>
+              </w:rPr>
+              <w:t xml:space="preserve">Meta-Program Axis</w:t>
+            </w:r>
+          </w:p>
+        </w:tc>
+        <w:tc>
+          <w:tcPr>
+            <w:tcW w:type="dxa" w:w="2050"/>
+            <w:tcBorders>
+              <w:top w:val="single" w:color="B0B0B0" w:sz="1"/>
+              <w:left w:val="single" w:color="B0B0B0" w:sz="1"/>
+              <w:bottom w:val="single" w:color="B0B0B0" w:sz="1"/>
+              <w:right w:val="single" w:color="B0B0B0" w:sz="1"/>
+            </w:tcBorders>
+            <w:shd w:fill="D9ECEE" w:val="clear"/>
+            <w:tcMar>
+              <w:top w:type="dxa" w:w="60"/>
+              <w:left w:type="dxa" w:w="100"/>
+              <w:bottom w:type="dxa" w:w="60"/>
+              <w:right w:type="dxa" w:w="100"/>
+            </w:tcMar>
+          </w:tcPr>
+          <w:p>
+            <w:pPr>
+              <w:spacing w:after="0" w:line="256"/>
+            </w:pPr>
+            <w:r>
+              <w:rPr>
+                <w:b/>
+                <w:bCs/>
+              </w:rPr>
+              <w:t xml:space="preserve">Reading</w:t>
+            </w:r>
+          </w:p>
+        </w:tc>
+        <w:tc>
+          <w:tcPr>
+            <w:tcW w:type="dxa" w:w="1100"/>
+            <w:tcBorders>
+              <w:top w:val="single" w:color="B0B0B0" w:sz="1"/>
+              <w:left w:val="single" w:color="B0B0B0" w:sz="1"/>
+              <w:bottom w:val="single" w:color="B0B0B0" w:sz="1"/>
+              <w:right w:val="single" w:color="B0B0B0" w:sz="1"/>
+            </w:tcBorders>
+            <w:shd w:fill="D9ECEE" w:val="clear"/>
+            <w:tcMar>
+              <w:top w:type="dxa" w:w="60"/>
+              <w:left w:type="dxa" w:w="100"/>
+              <w:bottom w:type="dxa" w:w="60"/>
+              <w:right w:type="dxa" w:w="100"/>
+            </w:tcMar>
+          </w:tcPr>
+          <w:p>
+            <w:pPr>
+              <w:spacing w:after="0" w:line="256"/>
+            </w:pPr>
+            <w:r>
+              <w:rPr>
+                <w:b/>
+                <w:bCs/>
+              </w:rPr>
+              <w:t xml:space="preserve">Status</w:t>
+            </w:r>
+          </w:p>
+        </w:tc>
+        <w:tc>
+          <w:tcPr>
+            <w:tcW w:type="dxa" w:w="3810"/>
+            <w:tcBorders>
+              <w:top w:val="single" w:color="B0B0B0" w:sz="1"/>
+              <w:left w:val="single" w:color="B0B0B0" w:sz="1"/>
+              <w:bottom w:val="single" w:color="B0B0B0" w:sz="1"/>
+              <w:right w:val="single" w:color="B0B0B0" w:sz="1"/>
+            </w:tcBorders>
+            <w:shd w:fill="D9ECEE" w:val="clear"/>
+            <w:tcMar>
+              <w:top w:type="dxa" w:w="60"/>
+              <w:left w:type="dxa" w:w="100"/>
+              <w:bottom w:type="dxa" w:w="60"/>
+              <w:right w:type="dxa" w:w="100"/>
+            </w:tcMar>
+          </w:tcPr>
+          <w:p>
+            <w:pPr>
+              <w:spacing w:after="0" w:line="256"/>
+            </w:pPr>
+            <w:r>
+              <w:rPr>
+                <w:b/>
+                <w:bCs/>
+              </w:rPr>
+              <w:t xml:space="preserve">Verbatim evidence</w:t>
+            </w:r>
+          </w:p>
+        </w:tc>
+      </w:tr>
+      <w:tr>
+        <w:tc>
+          <w:tcPr>
+            <w:tcW w:type="dxa" w:w="2400"/>
+            <w:tcBorders>
+              <w:top w:val="single" w:color="B0B0B0" w:sz="1"/>
+              <w:left w:val="single" w:color="B0B0B0" w:sz="1"/>
+              <w:bottom w:val="single" w:color="B0B0B0" w:sz="1"/>
+              <w:right w:val="single" w:color="B0B0B0" w:sz="1"/>
+            </w:tcBorders>
+            <w:tcMar>
+              <w:top w:type="dxa" w:w="60"/>
+              <w:left w:type="dxa" w:w="100"/>
+              <w:bottom w:type="dxa" w:w="60"/>
+              <w:right w:type="dxa" w:w="100"/>
+            </w:tcMar>
+          </w:tcPr>
+          <w:p>
+            <w:pPr>
+              <w:spacing w:after="0" w:line="256"/>
+            </w:pPr>
+            <w:r>
+              <w:rPr>
+                <w:b/>
+                <w:bCs/>
+              </w:rPr>
+              <w:t xml:space="preserve">Timeline layout</w:t>
+            </w:r>
+          </w:p>
+        </w:tc>
+        <w:tc>
+          <w:tcPr>
+            <w:tcW w:type="dxa" w:w="2050"/>
+            <w:tcBorders>
+              <w:top w:val="single" w:color="B0B0B0" w:sz="1"/>
+              <w:left w:val="single" w:color="B0B0B0" w:sz="1"/>
+              <w:bottom w:val="single" w:color="B0B0B0" w:sz="1"/>
+              <w:right w:val="single" w:color="B0B0B0" w:sz="1"/>
+            </w:tcBorders>
+            <w:tcMar>
+              <w:top w:type="dxa" w:w="60"/>
+              <w:left w:type="dxa" w:w="100"/>
+              <w:bottom w:type="dxa" w:w="60"/>
+              <w:right w:type="dxa" w:w="100"/>
+            </w:tcMar>
+          </w:tcPr>
+          <w:p>
+            <w:pPr>
+              <w:spacing w:after="0" w:line="256"/>
+            </w:pPr>
+            <w:r>
+              <w:rPr>
+                <w:b w:val="false"/>
+                <w:bCs w:val="false"/>
+              </w:rPr>
+              <w:t xml:space="preserve">Past-left, dimmed; future ahead + right</w:t>
+            </w:r>
+          </w:p>
+        </w:tc>
+        <w:tc>
+          <w:tcPr>
+            <w:tcW w:type="dxa" w:w="1100"/>
+            <w:tcBorders>
+              <w:top w:val="single" w:color="B0B0B0" w:sz="1"/>
+              <w:left w:val="single" w:color="B0B0B0" w:sz="1"/>
+              <w:bottom w:val="single" w:color="B0B0B0" w:sz="1"/>
+              <w:right w:val="single" w:color="B0B0B0" w:sz="1"/>
+            </w:tcBorders>
+            <w:shd w:fill="E8F2E2" w:val="clear"/>
+            <w:tcMar>
+              <w:top w:type="dxa" w:w="60"/>
+              <w:left w:type="dxa" w:w="100"/>
+              <w:bottom w:type="dxa" w:w="60"/>
+              <w:right w:type="dxa" w:w="100"/>
+            </w:tcMar>
+          </w:tcPr>
+          <w:p>
+            <w:pPr>
+              <w:spacing w:after="0" w:line="256"/>
+            </w:pPr>
+            <w:r>
+              <w:rPr>
+                <w:b/>
+                <w:bCs/>
+              </w:rPr>
+              <w:t xml:space="preserve">LOCKED</w:t>
+            </w:r>
+          </w:p>
+        </w:tc>
+        <w:tc>
+          <w:tcPr>
+            <w:tcW w:type="dxa" w:w="3810"/>
+            <w:tcBorders>
+              <w:top w:val="single" w:color="B0B0B0" w:sz="1"/>
+              <w:left w:val="single" w:color="B0B0B0" w:sz="1"/>
+              <w:bottom w:val="single" w:color="B0B0B0" w:sz="1"/>
+              <w:right w:val="single" w:color="B0B0B0" w:sz="1"/>
+            </w:tcBorders>
+            <w:tcMar>
+              <w:top w:type="dxa" w:w="60"/>
+              <w:left w:type="dxa" w:w="100"/>
+              <w:bottom w:type="dxa" w:w="60"/>
+              <w:right w:type="dxa" w:w="100"/>
+            </w:tcMar>
+          </w:tcPr>
+          <w:p>
+            <w:pPr>
+              <w:spacing w:after="0" w:line="256"/>
+            </w:pPr>
+            <w:r>
+              <w:rPr>
+                <w:b w:val="false"/>
+                <w:bCs w:val="false"/>
+              </w:rPr>
+              <w:t xml:space="preserve">Past = left and smaller/darker; future = road-ahead plus a timeline to the right; memories = "a whirling cloud of floating video screens."</w:t>
+            </w:r>
+          </w:p>
+        </w:tc>
+      </w:tr>
+      <w:tr>
+        <w:tc>
+          <w:tcPr>
+            <w:tcW w:type="dxa" w:w="2400"/>
+            <w:tcBorders>
+              <w:top w:val="single" w:color="B0B0B0" w:sz="1"/>
+              <w:left w:val="single" w:color="B0B0B0" w:sz="1"/>
+              <w:bottom w:val="single" w:color="B0B0B0" w:sz="1"/>
+              <w:right w:val="single" w:color="B0B0B0" w:sz="1"/>
+            </w:tcBorders>
+            <w:tcMar>
+              <w:top w:type="dxa" w:w="60"/>
+              <w:left w:type="dxa" w:w="100"/>
+              <w:bottom w:type="dxa" w:w="60"/>
+              <w:right w:type="dxa" w:w="100"/>
+            </w:tcMar>
+          </w:tcPr>
+          <w:p>
+            <w:pPr>
+              <w:spacing w:after="0" w:line="256"/>
+            </w:pPr>
+            <w:r>
+              <w:rPr>
+                <w:b/>
+                <w:bCs/>
+              </w:rPr>
+              <w:t xml:space="preserve">Temporal orientation</w:t>
+            </w:r>
+          </w:p>
+        </w:tc>
+        <w:tc>
+          <w:tcPr>
+            <w:tcW w:type="dxa" w:w="2050"/>
+            <w:tcBorders>
+              <w:top w:val="single" w:color="B0B0B0" w:sz="1"/>
+              <w:left w:val="single" w:color="B0B0B0" w:sz="1"/>
+              <w:bottom w:val="single" w:color="B0B0B0" w:sz="1"/>
+              <w:right w:val="single" w:color="B0B0B0" w:sz="1"/>
+            </w:tcBorders>
+            <w:tcMar>
+              <w:top w:type="dxa" w:w="60"/>
+              <w:left w:type="dxa" w:w="100"/>
+              <w:bottom w:type="dxa" w:w="60"/>
+              <w:right w:type="dxa" w:w="100"/>
+            </w:tcMar>
+          </w:tcPr>
+          <w:p>
+            <w:pPr>
+              <w:spacing w:after="0" w:line="256"/>
+            </w:pPr>
+            <w:r>
+              <w:rPr>
+                <w:b w:val="false"/>
+                <w:bCs w:val="false"/>
+              </w:rPr>
+              <w:t xml:space="preserve">Future-oriented (present-capable)</w:t>
+            </w:r>
+          </w:p>
+        </w:tc>
+        <w:tc>
+          <w:tcPr>
+            <w:tcW w:type="dxa" w:w="1100"/>
+            <w:tcBorders>
+              <w:top w:val="single" w:color="B0B0B0" w:sz="1"/>
+              <w:left w:val="single" w:color="B0B0B0" w:sz="1"/>
+              <w:bottom w:val="single" w:color="B0B0B0" w:sz="1"/>
+              <w:right w:val="single" w:color="B0B0B0" w:sz="1"/>
+            </w:tcBorders>
+            <w:shd w:fill="E8F2E2" w:val="clear"/>
+            <w:tcMar>
+              <w:top w:type="dxa" w:w="60"/>
+              <w:left w:type="dxa" w:w="100"/>
+              <w:bottom w:type="dxa" w:w="60"/>
+              <w:right w:type="dxa" w:w="100"/>
+            </w:tcMar>
+          </w:tcPr>
+          <w:p>
+            <w:pPr>
+              <w:spacing w:after="0" w:line="256"/>
+            </w:pPr>
+            <w:r>
+              <w:rPr>
+                <w:b/>
+                <w:bCs/>
+              </w:rPr>
+              <w:t xml:space="preserve">LOCKED</w:t>
+            </w:r>
+          </w:p>
+        </w:tc>
+        <w:tc>
+          <w:tcPr>
+            <w:tcW w:type="dxa" w:w="3810"/>
+            <w:tcBorders>
+              <w:top w:val="single" w:color="B0B0B0" w:sz="1"/>
+              <w:left w:val="single" w:color="B0B0B0" w:sz="1"/>
+              <w:bottom w:val="single" w:color="B0B0B0" w:sz="1"/>
+              <w:right w:val="single" w:color="B0B0B0" w:sz="1"/>
+            </w:tcBorders>
+            <w:tcMar>
+              <w:top w:type="dxa" w:w="60"/>
+              <w:left w:type="dxa" w:w="100"/>
+              <w:bottom w:type="dxa" w:w="60"/>
+              <w:right w:type="dxa" w:w="100"/>
+            </w:tcMar>
+          </w:tcPr>
+          <w:p>
+            <w:pPr>
+              <w:spacing w:after="0" w:line="256"/>
+            </w:pPr>
+            <w:r>
+              <w:rPr>
+                <w:b w:val="false"/>
+                <w:bCs w:val="false"/>
+              </w:rPr>
+              <w:t xml:space="preserve">"plotting next moves"; can drop into the present; past = "a solid foundation."</w:t>
+            </w:r>
+          </w:p>
+        </w:tc>
+      </w:tr>
+      <w:tr>
+        <w:tc>
+          <w:tcPr>
+            <w:tcW w:type="dxa" w:w="2400"/>
+            <w:tcBorders>
+              <w:top w:val="single" w:color="B0B0B0" w:sz="1"/>
+              <w:left w:val="single" w:color="B0B0B0" w:sz="1"/>
+              <w:bottom w:val="single" w:color="B0B0B0" w:sz="1"/>
+              <w:right w:val="single" w:color="B0B0B0" w:sz="1"/>
+            </w:tcBorders>
+            <w:tcMar>
+              <w:top w:type="dxa" w:w="60"/>
+              <w:left w:type="dxa" w:w="100"/>
+              <w:bottom w:type="dxa" w:w="60"/>
+              <w:right w:type="dxa" w:w="100"/>
+            </w:tcMar>
+          </w:tcPr>
+          <w:p>
+            <w:pPr>
+              <w:spacing w:after="0" w:line="256"/>
+            </w:pPr>
+            <w:r>
+              <w:rPr>
+                <w:b/>
+                <w:bCs/>
+              </w:rPr>
+              <w:t xml:space="preserve">Pacing under time</w:t>
+            </w:r>
+          </w:p>
+        </w:tc>
+        <w:tc>
+          <w:tcPr>
+            <w:tcW w:type="dxa" w:w="2050"/>
+            <w:tcBorders>
+              <w:top w:val="single" w:color="B0B0B0" w:sz="1"/>
+              <w:left w:val="single" w:color="B0B0B0" w:sz="1"/>
+              <w:bottom w:val="single" w:color="B0B0B0" w:sz="1"/>
+              <w:right w:val="single" w:color="B0B0B0" w:sz="1"/>
+            </w:tcBorders>
+            <w:tcMar>
+              <w:top w:type="dxa" w:w="60"/>
+              <w:left w:type="dxa" w:w="100"/>
+              <w:bottom w:type="dxa" w:w="60"/>
+              <w:right w:type="dxa" w:w="100"/>
+            </w:tcMar>
+          </w:tcPr>
+          <w:p>
+            <w:pPr>
+              <w:spacing w:after="0" w:line="256"/>
+            </w:pPr>
+            <w:r>
+              <w:rPr>
+                <w:b w:val="false"/>
+                <w:bCs w:val="false"/>
+              </w:rPr>
+              <w:t xml:space="preserve">Deadline-driven; time is abundant</w:t>
+            </w:r>
+          </w:p>
+        </w:tc>
+        <w:tc>
+          <w:tcPr>
+            <w:tcW w:type="dxa" w:w="1100"/>
+            <w:tcBorders>
+              <w:top w:val="single" w:color="B0B0B0" w:sz="1"/>
+              <w:left w:val="single" w:color="B0B0B0" w:sz="1"/>
+              <w:bottom w:val="single" w:color="B0B0B0" w:sz="1"/>
+              <w:right w:val="single" w:color="B0B0B0" w:sz="1"/>
+            </w:tcBorders>
+            <w:shd w:fill="E8F2E2" w:val="clear"/>
+            <w:tcMar>
+              <w:top w:type="dxa" w:w="60"/>
+              <w:left w:type="dxa" w:w="100"/>
+              <w:bottom w:type="dxa" w:w="60"/>
+              <w:right w:type="dxa" w:w="100"/>
+            </w:tcMar>
+          </w:tcPr>
+          <w:p>
+            <w:pPr>
+              <w:spacing w:after="0" w:line="256"/>
+            </w:pPr>
+            <w:r>
+              <w:rPr>
+                <w:b/>
+                <w:bCs/>
+              </w:rPr>
+              <w:t xml:space="preserve">LOCKED</w:t>
+            </w:r>
+          </w:p>
+        </w:tc>
+        <w:tc>
+          <w:tcPr>
+            <w:tcW w:type="dxa" w:w="3810"/>
+            <w:tcBorders>
+              <w:top w:val="single" w:color="B0B0B0" w:sz="1"/>
+              <w:left w:val="single" w:color="B0B0B0" w:sz="1"/>
+              <w:bottom w:val="single" w:color="B0B0B0" w:sz="1"/>
+              <w:right w:val="single" w:color="B0B0B0" w:sz="1"/>
+            </w:tcBorders>
+            <w:tcMar>
+              <w:top w:type="dxa" w:w="60"/>
+              <w:left w:type="dxa" w:w="100"/>
+              <w:bottom w:type="dxa" w:w="60"/>
+              <w:right w:type="dxa" w:w="100"/>
+            </w:tcMar>
+          </w:tcPr>
+          <w:p>
+            <w:pPr>
+              <w:spacing w:after="0" w:line="256"/>
+            </w:pPr>
+            <w:r>
+              <w:rPr>
+                <w:b w:val="false"/>
+                <w:bCs w:val="false"/>
+              </w:rPr>
+              <w:t xml:space="preserve">Moves "when running out of time," yet "there’s always enough" time.</w:t>
+            </w:r>
+          </w:p>
+        </w:tc>
+      </w:tr>
+      <w:tr>
+        <w:tc>
+          <w:tcPr>
+            <w:tcW w:type="dxa" w:w="2400"/>
+            <w:tcBorders>
+              <w:top w:val="single" w:color="B0B0B0" w:sz="1"/>
+              <w:left w:val="single" w:color="B0B0B0" w:sz="1"/>
+              <w:bottom w:val="single" w:color="B0B0B0" w:sz="1"/>
+              <w:right w:val="single" w:color="B0B0B0" w:sz="1"/>
+            </w:tcBorders>
+            <w:tcMar>
+              <w:top w:type="dxa" w:w="60"/>
+              <w:left w:type="dxa" w:w="100"/>
+              <w:bottom w:type="dxa" w:w="60"/>
+              <w:right w:type="dxa" w:w="100"/>
+            </w:tcMar>
+          </w:tcPr>
+          <w:p>
+            <w:pPr>
+              <w:spacing w:after="0" w:line="256"/>
+            </w:pPr>
+            <w:r>
+              <w:rPr>
+                <w:b/>
+                <w:bCs/>
+              </w:rPr>
+              <w:t xml:space="preserve">Narrative continuity</w:t>
+            </w:r>
+          </w:p>
+        </w:tc>
+        <w:tc>
+          <w:tcPr>
+            <w:tcW w:type="dxa" w:w="2050"/>
+            <w:tcBorders>
+              <w:top w:val="single" w:color="B0B0B0" w:sz="1"/>
+              <w:left w:val="single" w:color="B0B0B0" w:sz="1"/>
+              <w:bottom w:val="single" w:color="B0B0B0" w:sz="1"/>
+              <w:right w:val="single" w:color="B0B0B0" w:sz="1"/>
+            </w:tcBorders>
+            <w:tcMar>
+              <w:top w:type="dxa" w:w="60"/>
+              <w:left w:type="dxa" w:w="100"/>
+              <w:bottom w:type="dxa" w:w="60"/>
+              <w:right w:type="dxa" w:w="100"/>
+            </w:tcMar>
+          </w:tcPr>
+          <w:p>
+            <w:pPr>
+              <w:spacing w:after="0" w:line="256"/>
+            </w:pPr>
+            <w:r>
+              <w:rPr>
+                <w:b w:val="false"/>
+                <w:bCs w:val="false"/>
+              </w:rPr>
+              <w:t xml:space="preserve">Life as a continuous story</w:t>
+            </w:r>
+          </w:p>
+        </w:tc>
+        <w:tc>
+          <w:tcPr>
+            <w:tcW w:type="dxa" w:w="1100"/>
+            <w:tcBorders>
+              <w:top w:val="single" w:color="B0B0B0" w:sz="1"/>
+              <w:left w:val="single" w:color="B0B0B0" w:sz="1"/>
+              <w:bottom w:val="single" w:color="B0B0B0" w:sz="1"/>
+              <w:right w:val="single" w:color="B0B0B0" w:sz="1"/>
+            </w:tcBorders>
+            <w:shd w:fill="E8F2E2" w:val="clear"/>
+            <w:tcMar>
+              <w:top w:type="dxa" w:w="60"/>
+              <w:left w:type="dxa" w:w="100"/>
+              <w:bottom w:type="dxa" w:w="60"/>
+              <w:right w:type="dxa" w:w="100"/>
+            </w:tcMar>
+          </w:tcPr>
+          <w:p>
+            <w:pPr>
+              <w:spacing w:after="0" w:line="256"/>
+            </w:pPr>
+            <w:r>
+              <w:rPr>
+                <w:b/>
+                <w:bCs/>
+              </w:rPr>
+              <w:t xml:space="preserve">LOCKED</w:t>
+            </w:r>
+          </w:p>
+        </w:tc>
+        <w:tc>
+          <w:tcPr>
+            <w:tcW w:type="dxa" w:w="3810"/>
+            <w:tcBorders>
+              <w:top w:val="single" w:color="B0B0B0" w:sz="1"/>
+              <w:left w:val="single" w:color="B0B0B0" w:sz="1"/>
+              <w:bottom w:val="single" w:color="B0B0B0" w:sz="1"/>
+              <w:right w:val="single" w:color="B0B0B0" w:sz="1"/>
+            </w:tcBorders>
+            <w:tcMar>
+              <w:top w:type="dxa" w:w="60"/>
+              <w:left w:type="dxa" w:w="100"/>
+              <w:bottom w:type="dxa" w:w="60"/>
+              <w:right w:type="dxa" w:w="100"/>
+            </w:tcMar>
+          </w:tcPr>
+          <w:p>
+            <w:pPr>
+              <w:spacing w:after="0" w:line="256"/>
+            </w:pPr>
+            <w:r>
+              <w:rPr>
+                <w:b w:val="false"/>
+                <w:bCs w:val="false"/>
+              </w:rPr>
+              <w:t xml:space="preserve">Milestones mapped by emotional change; life reads as one unbroken story.</w:t>
+            </w:r>
+          </w:p>
+        </w:tc>
+      </w:tr>
+      <w:tr>
+        <w:tc>
+          <w:tcPr>
+            <w:tcW w:type="dxa" w:w="2400"/>
+            <w:tcBorders>
+              <w:top w:val="single" w:color="B0B0B0" w:sz="1"/>
+              <w:left w:val="single" w:color="B0B0B0" w:sz="1"/>
+              <w:bottom w:val="single" w:color="B0B0B0" w:sz="1"/>
+              <w:right w:val="single" w:color="B0B0B0" w:sz="1"/>
+            </w:tcBorders>
+            <w:tcMar>
+              <w:top w:type="dxa" w:w="60"/>
+              <w:left w:type="dxa" w:w="100"/>
+              <w:bottom w:type="dxa" w:w="60"/>
+              <w:right w:type="dxa" w:w="100"/>
+            </w:tcMar>
+          </w:tcPr>
+          <w:p>
+            <w:pPr>
+              <w:spacing w:after="0" w:line="256"/>
+            </w:pPr>
+            <w:r>
+              <w:rPr>
+                <w:b/>
+                <w:bCs/>
+              </w:rPr>
+              <w:t xml:space="preserve">Dissociation from past pain</w:t>
+            </w:r>
+          </w:p>
+        </w:tc>
+        <w:tc>
+          <w:tcPr>
+            <w:tcW w:type="dxa" w:w="2050"/>
+            <w:tcBorders>
+              <w:top w:val="single" w:color="B0B0B0" w:sz="1"/>
+              <w:left w:val="single" w:color="B0B0B0" w:sz="1"/>
+              <w:bottom w:val="single" w:color="B0B0B0" w:sz="1"/>
+              <w:right w:val="single" w:color="B0B0B0" w:sz="1"/>
+            </w:tcBorders>
+            <w:tcMar>
+              <w:top w:type="dxa" w:w="60"/>
+              <w:left w:type="dxa" w:w="100"/>
+              <w:bottom w:type="dxa" w:w="60"/>
+              <w:right w:type="dxa" w:w="100"/>
+            </w:tcMar>
+          </w:tcPr>
+          <w:p>
+            <w:pPr>
+              <w:spacing w:after="0" w:line="256"/>
+            </w:pPr>
+            <w:r>
+              <w:rPr>
+                <w:b w:val="false"/>
+                <w:bCs w:val="false"/>
+              </w:rPr>
+              <w:t xml:space="preserve">Dissociated (key resilience marker)</w:t>
+            </w:r>
+          </w:p>
+        </w:tc>
+        <w:tc>
+          <w:tcPr>
+            <w:tcW w:type="dxa" w:w="1100"/>
+            <w:tcBorders>
+              <w:top w:val="single" w:color="B0B0B0" w:sz="1"/>
+              <w:left w:val="single" w:color="B0B0B0" w:sz="1"/>
+              <w:bottom w:val="single" w:color="B0B0B0" w:sz="1"/>
+              <w:right w:val="single" w:color="B0B0B0" w:sz="1"/>
+            </w:tcBorders>
+            <w:shd w:fill="E8F2E2" w:val="clear"/>
+            <w:tcMar>
+              <w:top w:type="dxa" w:w="60"/>
+              <w:left w:type="dxa" w:w="100"/>
+              <w:bottom w:type="dxa" w:w="60"/>
+              <w:right w:type="dxa" w:w="100"/>
+            </w:tcMar>
+          </w:tcPr>
+          <w:p>
+            <w:pPr>
+              <w:spacing w:after="0" w:line="256"/>
+            </w:pPr>
+            <w:r>
+              <w:rPr>
+                <w:b/>
+                <w:bCs/>
+              </w:rPr>
+              <w:t xml:space="preserve">LOCKED</w:t>
+            </w:r>
+          </w:p>
+        </w:tc>
+        <w:tc>
+          <w:tcPr>
+            <w:tcW w:type="dxa" w:w="3810"/>
+            <w:tcBorders>
+              <w:top w:val="single" w:color="B0B0B0" w:sz="1"/>
+              <w:left w:val="single" w:color="B0B0B0" w:sz="1"/>
+              <w:bottom w:val="single" w:color="B0B0B0" w:sz="1"/>
+              <w:right w:val="single" w:color="B0B0B0" w:sz="1"/>
+            </w:tcBorders>
+            <w:tcMar>
+              <w:top w:type="dxa" w:w="60"/>
+              <w:left w:type="dxa" w:w="100"/>
+              <w:bottom w:type="dxa" w:w="60"/>
+              <w:right w:type="dxa" w:w="100"/>
+            </w:tcMar>
+          </w:tcPr>
+          <w:p>
+            <w:pPr>
+              <w:spacing w:after="0" w:line="256"/>
+            </w:pPr>
+            <w:r>
+              <w:rPr>
+                <w:b w:val="false"/>
+                <w:bCs w:val="false"/>
+              </w:rPr>
+              <w:t xml:space="preserve">Asked to step back into past pain and feel it again: "No." He does not re-enter old wounds — this is the mechanism behind "pain as fuel."</w:t>
+            </w:r>
+          </w:p>
+        </w:tc>
+      </w:tr>
+      <w:tr>
+        <w:tc>
+          <w:tcPr>
+            <w:tcW w:type="dxa" w:w="2400"/>
+            <w:tcBorders>
+              <w:top w:val="single" w:color="B0B0B0" w:sz="1"/>
+              <w:left w:val="single" w:color="B0B0B0" w:sz="1"/>
+              <w:bottom w:val="single" w:color="B0B0B0" w:sz="1"/>
+              <w:right w:val="single" w:color="B0B0B0" w:sz="1"/>
+            </w:tcBorders>
+            <w:tcMar>
+              <w:top w:type="dxa" w:w="60"/>
+              <w:left w:type="dxa" w:w="100"/>
+              <w:bottom w:type="dxa" w:w="60"/>
+              <w:right w:type="dxa" w:w="100"/>
+            </w:tcMar>
+          </w:tcPr>
+          <w:p>
+            <w:pPr>
+              <w:spacing w:after="0" w:line="256"/>
+            </w:pPr>
+            <w:r>
+              <w:rPr>
+                <w:b/>
+                <w:bCs/>
+              </w:rPr>
+              <w:t xml:space="preserve">Mortality frame</w:t>
+            </w:r>
+          </w:p>
+        </w:tc>
+        <w:tc>
+          <w:tcPr>
+            <w:tcW w:type="dxa" w:w="2050"/>
+            <w:tcBorders>
+              <w:top w:val="single" w:color="B0B0B0" w:sz="1"/>
+              <w:left w:val="single" w:color="B0B0B0" w:sz="1"/>
+              <w:bottom w:val="single" w:color="B0B0B0" w:sz="1"/>
+              <w:right w:val="single" w:color="B0B0B0" w:sz="1"/>
+            </w:tcBorders>
+            <w:tcMar>
+              <w:top w:type="dxa" w:w="60"/>
+              <w:left w:type="dxa" w:w="100"/>
+              <w:bottom w:type="dxa" w:w="60"/>
+              <w:right w:type="dxa" w:w="100"/>
+            </w:tcMar>
+          </w:tcPr>
+          <w:p>
+            <w:pPr>
+              <w:spacing w:after="0" w:line="256"/>
+            </w:pPr>
+            <w:r>
+              <w:rPr>
+                <w:b w:val="false"/>
+                <w:bCs w:val="false"/>
+              </w:rPr>
+              <w:t xml:space="preserve">Death as clarity filter</w:t>
+            </w:r>
+          </w:p>
+        </w:tc>
+        <w:tc>
+          <w:tcPr>
+            <w:tcW w:type="dxa" w:w="1100"/>
+            <w:tcBorders>
+              <w:top w:val="single" w:color="B0B0B0" w:sz="1"/>
+              <w:left w:val="single" w:color="B0B0B0" w:sz="1"/>
+              <w:bottom w:val="single" w:color="B0B0B0" w:sz="1"/>
+              <w:right w:val="single" w:color="B0B0B0" w:sz="1"/>
+            </w:tcBorders>
+            <w:shd w:fill="E8F2E2" w:val="clear"/>
+            <w:tcMar>
+              <w:top w:type="dxa" w:w="60"/>
+              <w:left w:type="dxa" w:w="100"/>
+              <w:bottom w:type="dxa" w:w="60"/>
+              <w:right w:type="dxa" w:w="100"/>
+            </w:tcMar>
+          </w:tcPr>
+          <w:p>
+            <w:pPr>
+              <w:spacing w:after="0" w:line="256"/>
+            </w:pPr>
+            <w:r>
+              <w:rPr>
+                <w:b/>
+                <w:bCs/>
+              </w:rPr>
+              <w:t xml:space="preserve">LOCKED</w:t>
+            </w:r>
+          </w:p>
+        </w:tc>
+        <w:tc>
+          <w:tcPr>
+            <w:tcW w:type="dxa" w:w="3810"/>
+            <w:tcBorders>
+              <w:top w:val="single" w:color="B0B0B0" w:sz="1"/>
+              <w:left w:val="single" w:color="B0B0B0" w:sz="1"/>
+              <w:bottom w:val="single" w:color="B0B0B0" w:sz="1"/>
+              <w:right w:val="single" w:color="B0B0B0" w:sz="1"/>
+            </w:tcBorders>
+            <w:tcMar>
+              <w:top w:type="dxa" w:w="60"/>
+              <w:left w:type="dxa" w:w="100"/>
+              <w:bottom w:type="dxa" w:w="60"/>
+              <w:right w:type="dxa" w:w="100"/>
+            </w:tcMar>
+          </w:tcPr>
+          <w:p>
+            <w:pPr>
+              <w:spacing w:after="0" w:line="256"/>
+            </w:pPr>
+            <w:r>
+              <w:rPr>
+                <w:b w:val="false"/>
+                <w:bCs w:val="false"/>
+              </w:rPr>
+              <w:t xml:space="preserve">Death used as a clarity filter; aims to maximize healthspan; legacy not yet planned.</w:t>
+            </w:r>
+          </w:p>
+        </w:tc>
+      </w:tr>
+    </w:tbl>
+    <w:p>
+      <w:pPr>
+        <w:spacing w:after="160"/>
+      </w:pPr>
+    </w:p>
+    <w:p>
+      <w:pPr>
+        <w:pStyle w:val="Heading2"/>
+        <w:spacing w:after="80" w:before="160"/>
+      </w:pPr>
+      <w:r>
+        <w:rPr>
+          <w:color w:val="20808D"/>
+        </w:rPr>
+        <w:t xml:space="preserve">Matrix 7 — Relational &amp; Power Dynamics</w:t>
+      </w:r>
+    </w:p>
+    <w:p>
+      <w:pPr>
+        <w:spacing w:after="100" w:line="276"/>
+      </w:pPr>
+      <w:r>
+        <w:rPr>
+          <w:i/>
+          <w:iCs/>
+          <w:color w:val="7A7974"/>
+        </w:rPr>
+        <w:t xml:space="preserve">How you handle conflict, influence, and standing among others. Mostly captured.</w:t>
+      </w:r>
+    </w:p>
+    <w:tbl>
+      <w:tblPr>
+        <w:tblW w:type="dxa" w:w="9360"/>
+        <w:tblBorders>
+          <w:top w:val="single" w:color="auto" w:sz="4"/>
+          <w:left w:val="single" w:color="auto" w:sz="4"/>
+          <w:bottom w:val="single" w:color="auto" w:sz="4"/>
+          <w:right w:val="single" w:color="auto" w:sz="4"/>
+          <w:insideH w:val="single" w:color="auto" w:sz="4"/>
+          <w:insideV w:val="single" w:color="auto" w:sz="4"/>
+        </w:tblBorders>
+      </w:tblPr>
+      <w:tblGrid>
+        <w:gridCol w:w="2400"/>
+        <w:gridCol w:w="2050"/>
+        <w:gridCol w:w="1100"/>
+        <w:gridCol w:w="3810"/>
+      </w:tblGrid>
+      <w:tr>
+        <w:trPr>
+          <w:tblHeader/>
+        </w:trPr>
+        <w:tc>
+          <w:tcPr>
+            <w:tcW w:type="dxa" w:w="2400"/>
+            <w:tcBorders>
+              <w:top w:val="single" w:color="B0B0B0" w:sz="1"/>
+              <w:left w:val="single" w:color="B0B0B0" w:sz="1"/>
+              <w:bottom w:val="single" w:color="B0B0B0" w:sz="1"/>
+              <w:right w:val="single" w:color="B0B0B0" w:sz="1"/>
+            </w:tcBorders>
+            <w:shd w:fill="D9ECEE" w:val="clear"/>
+            <w:tcMar>
+              <w:top w:type="dxa" w:w="60"/>
+              <w:left w:type="dxa" w:w="100"/>
+              <w:bottom w:type="dxa" w:w="60"/>
+              <w:right w:type="dxa" w:w="100"/>
+            </w:tcMar>
+          </w:tcPr>
+          <w:p>
+            <w:pPr>
+              <w:spacing w:after="0" w:line="256"/>
+            </w:pPr>
+            <w:r>
+              <w:rPr>
+                <w:b/>
+                <w:bCs/>
+              </w:rPr>
+              <w:t xml:space="preserve">Meta-Program Axis</w:t>
+            </w:r>
+          </w:p>
+        </w:tc>
+        <w:tc>
+          <w:tcPr>
+            <w:tcW w:type="dxa" w:w="2050"/>
+            <w:tcBorders>
+              <w:top w:val="single" w:color="B0B0B0" w:sz="1"/>
+              <w:left w:val="single" w:color="B0B0B0" w:sz="1"/>
+              <w:bottom w:val="single" w:color="B0B0B0" w:sz="1"/>
+              <w:right w:val="single" w:color="B0B0B0" w:sz="1"/>
+            </w:tcBorders>
+            <w:shd w:fill="D9ECEE" w:val="clear"/>
+            <w:tcMar>
+              <w:top w:type="dxa" w:w="60"/>
+              <w:left w:type="dxa" w:w="100"/>
+              <w:bottom w:type="dxa" w:w="60"/>
+              <w:right w:type="dxa" w:w="100"/>
+            </w:tcMar>
+          </w:tcPr>
+          <w:p>
+            <w:pPr>
+              <w:spacing w:after="0" w:line="256"/>
+            </w:pPr>
+            <w:r>
+              <w:rPr>
+                <w:b/>
+                <w:bCs/>
+              </w:rPr>
+              <w:t xml:space="preserve">Reading</w:t>
+            </w:r>
+          </w:p>
+        </w:tc>
+        <w:tc>
+          <w:tcPr>
+            <w:tcW w:type="dxa" w:w="1100"/>
+            <w:tcBorders>
+              <w:top w:val="single" w:color="B0B0B0" w:sz="1"/>
+              <w:left w:val="single" w:color="B0B0B0" w:sz="1"/>
+              <w:bottom w:val="single" w:color="B0B0B0" w:sz="1"/>
+              <w:right w:val="single" w:color="B0B0B0" w:sz="1"/>
+            </w:tcBorders>
+            <w:shd w:fill="D9ECEE" w:val="clear"/>
+            <w:tcMar>
+              <w:top w:type="dxa" w:w="60"/>
+              <w:left w:type="dxa" w:w="100"/>
+              <w:bottom w:type="dxa" w:w="60"/>
+              <w:right w:type="dxa" w:w="100"/>
+            </w:tcMar>
+          </w:tcPr>
+          <w:p>
+            <w:pPr>
+              <w:spacing w:after="0" w:line="256"/>
+            </w:pPr>
+            <w:r>
+              <w:rPr>
+                <w:b/>
+                <w:bCs/>
+              </w:rPr>
+              <w:t xml:space="preserve">Status</w:t>
+            </w:r>
+          </w:p>
+        </w:tc>
+        <w:tc>
+          <w:tcPr>
+            <w:tcW w:type="dxa" w:w="3810"/>
+            <w:tcBorders>
+              <w:top w:val="single" w:color="B0B0B0" w:sz="1"/>
+              <w:left w:val="single" w:color="B0B0B0" w:sz="1"/>
+              <w:bottom w:val="single" w:color="B0B0B0" w:sz="1"/>
+              <w:right w:val="single" w:color="B0B0B0" w:sz="1"/>
+            </w:tcBorders>
+            <w:shd w:fill="D9ECEE" w:val="clear"/>
+            <w:tcMar>
+              <w:top w:type="dxa" w:w="60"/>
+              <w:left w:type="dxa" w:w="100"/>
+              <w:bottom w:type="dxa" w:w="60"/>
+              <w:right w:type="dxa" w:w="100"/>
+            </w:tcMar>
+          </w:tcPr>
+          <w:p>
+            <w:pPr>
+              <w:spacing w:after="0" w:line="256"/>
+            </w:pPr>
+            <w:r>
+              <w:rPr>
+                <w:b/>
+                <w:bCs/>
+              </w:rPr>
+              <w:t xml:space="preserve">Verbatim evidence</w:t>
+            </w:r>
+          </w:p>
+        </w:tc>
+      </w:tr>
+      <w:tr>
+        <w:tc>
+          <w:tcPr>
+            <w:tcW w:type="dxa" w:w="2400"/>
+            <w:tcBorders>
+              <w:top w:val="single" w:color="B0B0B0" w:sz="1"/>
+              <w:left w:val="single" w:color="B0B0B0" w:sz="1"/>
+              <w:bottom w:val="single" w:color="B0B0B0" w:sz="1"/>
+              <w:right w:val="single" w:color="B0B0B0" w:sz="1"/>
+            </w:tcBorders>
+            <w:tcMar>
+              <w:top w:type="dxa" w:w="60"/>
+              <w:left w:type="dxa" w:w="100"/>
+              <w:bottom w:type="dxa" w:w="60"/>
+              <w:right w:type="dxa" w:w="100"/>
+            </w:tcMar>
+          </w:tcPr>
+          <w:p>
+            <w:pPr>
+              <w:spacing w:after="0" w:line="256"/>
+            </w:pPr>
+            <w:r>
+              <w:rPr>
+                <w:b/>
+                <w:bCs/>
+              </w:rPr>
+              <w:t xml:space="preserve">Conflict mode</w:t>
+            </w:r>
+          </w:p>
+        </w:tc>
+        <w:tc>
+          <w:tcPr>
+            <w:tcW w:type="dxa" w:w="2050"/>
+            <w:tcBorders>
+              <w:top w:val="single" w:color="B0B0B0" w:sz="1"/>
+              <w:left w:val="single" w:color="B0B0B0" w:sz="1"/>
+              <w:bottom w:val="single" w:color="B0B0B0" w:sz="1"/>
+              <w:right w:val="single" w:color="B0B0B0" w:sz="1"/>
+            </w:tcBorders>
+            <w:tcMar>
+              <w:top w:type="dxa" w:w="60"/>
+              <w:left w:type="dxa" w:w="100"/>
+              <w:bottom w:type="dxa" w:w="60"/>
+              <w:right w:type="dxa" w:w="100"/>
+            </w:tcMar>
+          </w:tcPr>
+          <w:p>
+            <w:pPr>
+              <w:spacing w:after="0" w:line="256"/>
+            </w:pPr>
+            <w:r>
+              <w:rPr>
+                <w:b w:val="false"/>
+                <w:bCs w:val="false"/>
+              </w:rPr>
+              <w:t xml:space="preserve">Wins sometimes / peace-keeps often</w:t>
+            </w:r>
+          </w:p>
+        </w:tc>
+        <w:tc>
+          <w:tcPr>
+            <w:tcW w:type="dxa" w:w="1100"/>
+            <w:tcBorders>
+              <w:top w:val="single" w:color="B0B0B0" w:sz="1"/>
+              <w:left w:val="single" w:color="B0B0B0" w:sz="1"/>
+              <w:bottom w:val="single" w:color="B0B0B0" w:sz="1"/>
+              <w:right w:val="single" w:color="B0B0B0" w:sz="1"/>
+            </w:tcBorders>
+            <w:shd w:fill="E8F2E2" w:val="clear"/>
+            <w:tcMar>
+              <w:top w:type="dxa" w:w="60"/>
+              <w:left w:type="dxa" w:w="100"/>
+              <w:bottom w:type="dxa" w:w="60"/>
+              <w:right w:type="dxa" w:w="100"/>
+            </w:tcMar>
+          </w:tcPr>
+          <w:p>
+            <w:pPr>
+              <w:spacing w:after="0" w:line="256"/>
+            </w:pPr>
+            <w:r>
+              <w:rPr>
+                <w:b/>
+                <w:bCs/>
+              </w:rPr>
+              <w:t xml:space="preserve">LOCKED</w:t>
+            </w:r>
+          </w:p>
+        </w:tc>
+        <w:tc>
+          <w:tcPr>
+            <w:tcW w:type="dxa" w:w="3810"/>
+            <w:tcBorders>
+              <w:top w:val="single" w:color="B0B0B0" w:sz="1"/>
+              <w:left w:val="single" w:color="B0B0B0" w:sz="1"/>
+              <w:bottom w:val="single" w:color="B0B0B0" w:sz="1"/>
+              <w:right w:val="single" w:color="B0B0B0" w:sz="1"/>
+            </w:tcBorders>
+            <w:tcMar>
+              <w:top w:type="dxa" w:w="60"/>
+              <w:left w:type="dxa" w:w="100"/>
+              <w:bottom w:type="dxa" w:w="60"/>
+              <w:right w:type="dxa" w:w="100"/>
+            </w:tcMar>
+          </w:tcPr>
+          <w:p>
+            <w:pPr>
+              <w:spacing w:after="0" w:line="256"/>
+            </w:pPr>
+            <w:r>
+              <w:rPr>
+                <w:b w:val="false"/>
+                <w:bCs w:val="false"/>
+              </w:rPr>
+              <w:t xml:space="preserve">"unfortunately sometimes yes" (wants to win); "swallow to keep peace many times — yes" — in tension with the confrontation axis.</w:t>
+            </w:r>
+          </w:p>
+        </w:tc>
+      </w:tr>
+      <w:tr>
+        <w:tc>
+          <w:tcPr>
+            <w:tcW w:type="dxa" w:w="2400"/>
+            <w:tcBorders>
+              <w:top w:val="single" w:color="B0B0B0" w:sz="1"/>
+              <w:left w:val="single" w:color="B0B0B0" w:sz="1"/>
+              <w:bottom w:val="single" w:color="B0B0B0" w:sz="1"/>
+              <w:right w:val="single" w:color="B0B0B0" w:sz="1"/>
+            </w:tcBorders>
+            <w:tcMar>
+              <w:top w:type="dxa" w:w="60"/>
+              <w:left w:type="dxa" w:w="100"/>
+              <w:bottom w:type="dxa" w:w="60"/>
+              <w:right w:type="dxa" w:w="100"/>
+            </w:tcMar>
+          </w:tcPr>
+          <w:p>
+            <w:pPr>
+              <w:spacing w:after="0" w:line="256"/>
+            </w:pPr>
+            <w:r>
+              <w:rPr>
+                <w:b/>
+                <w:bCs/>
+              </w:rPr>
+              <w:t xml:space="preserve">Influence ethics</w:t>
+            </w:r>
+          </w:p>
+        </w:tc>
+        <w:tc>
+          <w:tcPr>
+            <w:tcW w:type="dxa" w:w="2050"/>
+            <w:tcBorders>
+              <w:top w:val="single" w:color="B0B0B0" w:sz="1"/>
+              <w:left w:val="single" w:color="B0B0B0" w:sz="1"/>
+              <w:bottom w:val="single" w:color="B0B0B0" w:sz="1"/>
+              <w:right w:val="single" w:color="B0B0B0" w:sz="1"/>
+            </w:tcBorders>
+            <w:tcMar>
+              <w:top w:type="dxa" w:w="60"/>
+              <w:left w:type="dxa" w:w="100"/>
+              <w:bottom w:type="dxa" w:w="60"/>
+              <w:right w:type="dxa" w:w="100"/>
+            </w:tcMar>
+          </w:tcPr>
+          <w:p>
+            <w:pPr>
+              <w:spacing w:after="0" w:line="256"/>
+            </w:pPr>
+            <w:r>
+              <w:rPr>
+                <w:b w:val="false"/>
+                <w:bCs w:val="false"/>
+              </w:rPr>
+              <w:t xml:space="preserve">No manipulation; fast perspective-taking</w:t>
+            </w:r>
+          </w:p>
+        </w:tc>
+        <w:tc>
+          <w:tcPr>
+            <w:tcW w:type="dxa" w:w="1100"/>
+            <w:tcBorders>
+              <w:top w:val="single" w:color="B0B0B0" w:sz="1"/>
+              <w:left w:val="single" w:color="B0B0B0" w:sz="1"/>
+              <w:bottom w:val="single" w:color="B0B0B0" w:sz="1"/>
+              <w:right w:val="single" w:color="B0B0B0" w:sz="1"/>
+            </w:tcBorders>
+            <w:shd w:fill="E8F2E2" w:val="clear"/>
+            <w:tcMar>
+              <w:top w:type="dxa" w:w="60"/>
+              <w:left w:type="dxa" w:w="100"/>
+              <w:bottom w:type="dxa" w:w="60"/>
+              <w:right w:type="dxa" w:w="100"/>
+            </w:tcMar>
+          </w:tcPr>
+          <w:p>
+            <w:pPr>
+              <w:spacing w:after="0" w:line="256"/>
+            </w:pPr>
+            <w:r>
+              <w:rPr>
+                <w:b/>
+                <w:bCs/>
+              </w:rPr>
+              <w:t xml:space="preserve">LOCKED</w:t>
+            </w:r>
+          </w:p>
+        </w:tc>
+        <w:tc>
+          <w:tcPr>
+            <w:tcW w:type="dxa" w:w="3810"/>
+            <w:tcBorders>
+              <w:top w:val="single" w:color="B0B0B0" w:sz="1"/>
+              <w:left w:val="single" w:color="B0B0B0" w:sz="1"/>
+              <w:bottom w:val="single" w:color="B0B0B0" w:sz="1"/>
+              <w:right w:val="single" w:color="B0B0B0" w:sz="1"/>
+            </w:tcBorders>
+            <w:tcMar>
+              <w:top w:type="dxa" w:w="60"/>
+              <w:left w:type="dxa" w:w="100"/>
+              <w:bottom w:type="dxa" w:w="60"/>
+              <w:right w:type="dxa" w:w="100"/>
+            </w:tcMar>
+          </w:tcPr>
+          <w:p>
+            <w:pPr>
+              <w:spacing w:after="0" w:line="256"/>
+            </w:pPr>
+            <w:r>
+              <w:rPr>
+                <w:b w:val="false"/>
+                <w:bCs w:val="false"/>
+              </w:rPr>
+              <w:t xml:space="preserve">Declines manipulation; takes another’s perspective quickly.</w:t>
+            </w:r>
+          </w:p>
+        </w:tc>
+      </w:tr>
+      <w:tr>
+        <w:tc>
+          <w:tcPr>
+            <w:tcW w:type="dxa" w:w="2400"/>
+            <w:tcBorders>
+              <w:top w:val="single" w:color="B0B0B0" w:sz="1"/>
+              <w:left w:val="single" w:color="B0B0B0" w:sz="1"/>
+              <w:bottom w:val="single" w:color="B0B0B0" w:sz="1"/>
+              <w:right w:val="single" w:color="B0B0B0" w:sz="1"/>
+            </w:tcBorders>
+            <w:tcMar>
+              <w:top w:type="dxa" w:w="60"/>
+              <w:left w:type="dxa" w:w="100"/>
+              <w:bottom w:type="dxa" w:w="60"/>
+              <w:right w:type="dxa" w:w="100"/>
+            </w:tcMar>
+          </w:tcPr>
+          <w:p>
+            <w:pPr>
+              <w:spacing w:after="0" w:line="256"/>
+            </w:pPr>
+            <w:r>
+              <w:rPr>
+                <w:b/>
+                <w:bCs/>
+              </w:rPr>
+              <w:t xml:space="preserve">Power stance</w:t>
+            </w:r>
+          </w:p>
+        </w:tc>
+        <w:tc>
+          <w:tcPr>
+            <w:tcW w:type="dxa" w:w="2050"/>
+            <w:tcBorders>
+              <w:top w:val="single" w:color="B0B0B0" w:sz="1"/>
+              <w:left w:val="single" w:color="B0B0B0" w:sz="1"/>
+              <w:bottom w:val="single" w:color="B0B0B0" w:sz="1"/>
+              <w:right w:val="single" w:color="B0B0B0" w:sz="1"/>
+            </w:tcBorders>
+            <w:tcMar>
+              <w:top w:type="dxa" w:w="60"/>
+              <w:left w:type="dxa" w:w="100"/>
+              <w:bottom w:type="dxa" w:w="60"/>
+              <w:right w:type="dxa" w:w="100"/>
+            </w:tcMar>
+          </w:tcPr>
+          <w:p>
+            <w:pPr>
+              <w:spacing w:after="0" w:line="256"/>
+            </w:pPr>
+            <w:r>
+              <w:rPr>
+                <w:b w:val="false"/>
+                <w:bCs w:val="false"/>
+              </w:rPr>
+              <w:t xml:space="preserve">Leads in chaos; eye-to-eye with anyone</w:t>
+            </w:r>
+          </w:p>
+        </w:tc>
+        <w:tc>
+          <w:tcPr>
+            <w:tcW w:type="dxa" w:w="1100"/>
+            <w:tcBorders>
+              <w:top w:val="single" w:color="B0B0B0" w:sz="1"/>
+              <w:left w:val="single" w:color="B0B0B0" w:sz="1"/>
+              <w:bottom w:val="single" w:color="B0B0B0" w:sz="1"/>
+              <w:right w:val="single" w:color="B0B0B0" w:sz="1"/>
+            </w:tcBorders>
+            <w:shd w:fill="E8F2E2" w:val="clear"/>
+            <w:tcMar>
+              <w:top w:type="dxa" w:w="60"/>
+              <w:left w:type="dxa" w:w="100"/>
+              <w:bottom w:type="dxa" w:w="60"/>
+              <w:right w:type="dxa" w:w="100"/>
+            </w:tcMar>
+          </w:tcPr>
+          <w:p>
+            <w:pPr>
+              <w:spacing w:after="0" w:line="256"/>
+            </w:pPr>
+            <w:r>
+              <w:rPr>
+                <w:b/>
+                <w:bCs/>
+              </w:rPr>
+              <w:t xml:space="preserve">LOCKED</w:t>
+            </w:r>
+          </w:p>
+        </w:tc>
+        <w:tc>
+          <w:tcPr>
+            <w:tcW w:type="dxa" w:w="3810"/>
+            <w:tcBorders>
+              <w:top w:val="single" w:color="B0B0B0" w:sz="1"/>
+              <w:left w:val="single" w:color="B0B0B0" w:sz="1"/>
+              <w:bottom w:val="single" w:color="B0B0B0" w:sz="1"/>
+              <w:right w:val="single" w:color="B0B0B0" w:sz="1"/>
+            </w:tcBorders>
+            <w:tcMar>
+              <w:top w:type="dxa" w:w="60"/>
+              <w:left w:type="dxa" w:w="100"/>
+              <w:bottom w:type="dxa" w:w="60"/>
+              <w:right w:type="dxa" w:w="100"/>
+            </w:tcMar>
+          </w:tcPr>
+          <w:p>
+            <w:pPr>
+              <w:spacing w:after="0" w:line="256"/>
+            </w:pPr>
+            <w:r>
+              <w:rPr>
+                <w:b w:val="false"/>
+                <w:bCs w:val="false"/>
+              </w:rPr>
+              <w:t xml:space="preserve">Takes the lead when things go chaotic; meets billionaires eye-to-eye; treats service roles as equals; empowers others.</w:t>
+            </w:r>
+          </w:p>
+        </w:tc>
+      </w:tr>
+      <w:tr>
+        <w:tc>
+          <w:tcPr>
+            <w:tcW w:type="dxa" w:w="2400"/>
+            <w:tcBorders>
+              <w:top w:val="single" w:color="B0B0B0" w:sz="1"/>
+              <w:left w:val="single" w:color="B0B0B0" w:sz="1"/>
+              <w:bottom w:val="single" w:color="B0B0B0" w:sz="1"/>
+              <w:right w:val="single" w:color="B0B0B0" w:sz="1"/>
+            </w:tcBorders>
+            <w:tcMar>
+              <w:top w:type="dxa" w:w="60"/>
+              <w:left w:type="dxa" w:w="100"/>
+              <w:bottom w:type="dxa" w:w="60"/>
+              <w:right w:type="dxa" w:w="100"/>
+            </w:tcMar>
+          </w:tcPr>
+          <w:p>
+            <w:pPr>
+              <w:spacing w:after="0" w:line="256"/>
+            </w:pPr>
+            <w:r>
+              <w:rPr>
+                <w:b/>
+                <w:bCs/>
+              </w:rPr>
+              <w:t xml:space="preserve">Attachment items</w:t>
+            </w:r>
+          </w:p>
+        </w:tc>
+        <w:tc>
+          <w:tcPr>
+            <w:tcW w:type="dxa" w:w="2050"/>
+            <w:tcBorders>
+              <w:top w:val="single" w:color="B0B0B0" w:sz="1"/>
+              <w:left w:val="single" w:color="B0B0B0" w:sz="1"/>
+              <w:bottom w:val="single" w:color="B0B0B0" w:sz="1"/>
+              <w:right w:val="single" w:color="B0B0B0" w:sz="1"/>
+            </w:tcBorders>
+            <w:tcMar>
+              <w:top w:type="dxa" w:w="60"/>
+              <w:left w:type="dxa" w:w="100"/>
+              <w:bottom w:type="dxa" w:w="60"/>
+              <w:right w:type="dxa" w:w="100"/>
+            </w:tcMar>
+          </w:tcPr>
+          <w:p>
+            <w:pPr>
+              <w:spacing w:after="0" w:line="256"/>
+            </w:pPr>
+            <w:r>
+              <w:rPr>
+                <w:b w:val="false"/>
+                <w:bCs w:val="false"/>
+              </w:rPr>
+              <w:t xml:space="preserve">Partially captured</w:t>
+            </w:r>
+          </w:p>
+        </w:tc>
+        <w:tc>
+          <w:tcPr>
+            <w:tcW w:type="dxa" w:w="1100"/>
+            <w:tcBorders>
+              <w:top w:val="single" w:color="B0B0B0" w:sz="1"/>
+              <w:left w:val="single" w:color="B0B0B0" w:sz="1"/>
+              <w:bottom w:val="single" w:color="B0B0B0" w:sz="1"/>
+              <w:right w:val="single" w:color="B0B0B0" w:sz="1"/>
+            </w:tcBorders>
+            <w:shd w:fill="FBF2DE" w:val="clear"/>
+            <w:tcMar>
+              <w:top w:type="dxa" w:w="60"/>
+              <w:left w:type="dxa" w:w="100"/>
+              <w:bottom w:type="dxa" w:w="60"/>
+              <w:right w:type="dxa" w:w="100"/>
+            </w:tcMar>
+          </w:tcPr>
+          <w:p>
+            <w:pPr>
+              <w:spacing w:after="0" w:line="256"/>
+            </w:pPr>
+            <w:r>
+              <w:rPr>
+                <w:b/>
+                <w:bCs/>
+              </w:rPr>
+              <w:t xml:space="preserve">OPEN</w:t>
+            </w:r>
+          </w:p>
+        </w:tc>
+        <w:tc>
+          <w:tcPr>
+            <w:tcW w:type="dxa" w:w="3810"/>
+            <w:tcBorders>
+              <w:top w:val="single" w:color="B0B0B0" w:sz="1"/>
+              <w:left w:val="single" w:color="B0B0B0" w:sz="1"/>
+              <w:bottom w:val="single" w:color="B0B0B0" w:sz="1"/>
+              <w:right w:val="single" w:color="B0B0B0" w:sz="1"/>
+            </w:tcBorders>
+            <w:tcMar>
+              <w:top w:type="dxa" w:w="60"/>
+              <w:left w:type="dxa" w:w="100"/>
+              <w:bottom w:type="dxa" w:w="60"/>
+              <w:right w:type="dxa" w:w="100"/>
+            </w:tcMar>
+          </w:tcPr>
+          <w:p>
+            <w:pPr>
+              <w:spacing w:after="0" w:line="256"/>
+            </w:pPr>
+            <w:r>
+              <w:rPr>
+                <w:b w:val="false"/>
+                <w:bCs w:val="false"/>
+              </w:rPr>
+              <w:t xml:space="preserve">Several attachment-style items were garbled in dictation — not yet bound.</w:t>
+            </w:r>
+          </w:p>
+        </w:tc>
+      </w:tr>
+    </w:tbl>
+    <w:p>
+      <w:pPr>
+        <w:spacing w:after="160"/>
+      </w:pPr>
+    </w:p>
+    <w:p>
+      <w:pPr>
+        <w:pStyle w:val="Heading2"/>
+        <w:spacing w:after="80" w:before="160"/>
+      </w:pPr>
+      <w:r>
+        <w:rPr>
+          <w:color w:val="20808D"/>
+        </w:rPr>
+        <w:t xml:space="preserve">Matrix 9 — The Self Matrix (Worth &amp; Intention)</w:t>
+      </w:r>
+    </w:p>
+    <w:p>
+      <w:pPr>
+        <w:spacing w:after="100" w:line="276"/>
+      </w:pPr>
+      <w:r>
+        <w:rPr>
+          <w:i/>
+          <w:iCs/>
+          <w:color w:val="7A7974"/>
+        </w:rPr>
+        <w:t xml:space="preserve">The foundation layer — where worth comes from and what the work is for.</w:t>
+      </w:r>
+    </w:p>
+    <w:tbl>
+      <w:tblPr>
+        <w:tblW w:type="dxa" w:w="9360"/>
+        <w:tblBorders>
+          <w:top w:val="single" w:color="auto" w:sz="4"/>
+          <w:left w:val="single" w:color="auto" w:sz="4"/>
+          <w:bottom w:val="single" w:color="auto" w:sz="4"/>
+          <w:right w:val="single" w:color="auto" w:sz="4"/>
+          <w:insideH w:val="single" w:color="auto" w:sz="4"/>
+          <w:insideV w:val="single" w:color="auto" w:sz="4"/>
+        </w:tblBorders>
+      </w:tblPr>
+      <w:tblGrid>
+        <w:gridCol w:w="2400"/>
+        <w:gridCol w:w="2050"/>
+        <w:gridCol w:w="1100"/>
+        <w:gridCol w:w="3810"/>
+      </w:tblGrid>
+      <w:tr>
+        <w:trPr>
+          <w:tblHeader/>
+        </w:trPr>
+        <w:tc>
+          <w:tcPr>
+            <w:tcW w:type="dxa" w:w="2400"/>
+            <w:tcBorders>
+              <w:top w:val="single" w:color="B0B0B0" w:sz="1"/>
+              <w:left w:val="single" w:color="B0B0B0" w:sz="1"/>
+              <w:bottom w:val="single" w:color="B0B0B0" w:sz="1"/>
+              <w:right w:val="single" w:color="B0B0B0" w:sz="1"/>
+            </w:tcBorders>
+            <w:shd w:fill="D9ECEE" w:val="clear"/>
+            <w:tcMar>
+              <w:top w:type="dxa" w:w="60"/>
+              <w:left w:type="dxa" w:w="100"/>
+              <w:bottom w:type="dxa" w:w="60"/>
+              <w:right w:type="dxa" w:w="100"/>
+            </w:tcMar>
+          </w:tcPr>
+          <w:p>
+            <w:pPr>
+              <w:spacing w:after="0" w:line="256"/>
+            </w:pPr>
+            <w:r>
+              <w:rPr>
+                <w:b/>
+                <w:bCs/>
+              </w:rPr>
+              <w:t xml:space="preserve">Meta-Program Axis</w:t>
+            </w:r>
+          </w:p>
+        </w:tc>
+        <w:tc>
+          <w:tcPr>
+            <w:tcW w:type="dxa" w:w="2050"/>
+            <w:tcBorders>
+              <w:top w:val="single" w:color="B0B0B0" w:sz="1"/>
+              <w:left w:val="single" w:color="B0B0B0" w:sz="1"/>
+              <w:bottom w:val="single" w:color="B0B0B0" w:sz="1"/>
+              <w:right w:val="single" w:color="B0B0B0" w:sz="1"/>
+            </w:tcBorders>
+            <w:shd w:fill="D9ECEE" w:val="clear"/>
+            <w:tcMar>
+              <w:top w:type="dxa" w:w="60"/>
+              <w:left w:type="dxa" w:w="100"/>
+              <w:bottom w:type="dxa" w:w="60"/>
+              <w:right w:type="dxa" w:w="100"/>
+            </w:tcMar>
+          </w:tcPr>
+          <w:p>
+            <w:pPr>
+              <w:spacing w:after="0" w:line="256"/>
+            </w:pPr>
+            <w:r>
+              <w:rPr>
+                <w:b/>
+                <w:bCs/>
+              </w:rPr>
+              <w:t xml:space="preserve">Reading</w:t>
+            </w:r>
+          </w:p>
+        </w:tc>
+        <w:tc>
+          <w:tcPr>
+            <w:tcW w:type="dxa" w:w="1100"/>
+            <w:tcBorders>
+              <w:top w:val="single" w:color="B0B0B0" w:sz="1"/>
+              <w:left w:val="single" w:color="B0B0B0" w:sz="1"/>
+              <w:bottom w:val="single" w:color="B0B0B0" w:sz="1"/>
+              <w:right w:val="single" w:color="B0B0B0" w:sz="1"/>
+            </w:tcBorders>
+            <w:shd w:fill="D9ECEE" w:val="clear"/>
+            <w:tcMar>
+              <w:top w:type="dxa" w:w="60"/>
+              <w:left w:type="dxa" w:w="100"/>
+              <w:bottom w:type="dxa" w:w="60"/>
+              <w:right w:type="dxa" w:w="100"/>
+            </w:tcMar>
+          </w:tcPr>
+          <w:p>
+            <w:pPr>
+              <w:spacing w:after="0" w:line="256"/>
+            </w:pPr>
+            <w:r>
+              <w:rPr>
+                <w:b/>
+                <w:bCs/>
+              </w:rPr>
+              <w:t xml:space="preserve">Status</w:t>
+            </w:r>
+          </w:p>
+        </w:tc>
+        <w:tc>
+          <w:tcPr>
+            <w:tcW w:type="dxa" w:w="3810"/>
+            <w:tcBorders>
+              <w:top w:val="single" w:color="B0B0B0" w:sz="1"/>
+              <w:left w:val="single" w:color="B0B0B0" w:sz="1"/>
+              <w:bottom w:val="single" w:color="B0B0B0" w:sz="1"/>
+              <w:right w:val="single" w:color="B0B0B0" w:sz="1"/>
+            </w:tcBorders>
+            <w:shd w:fill="D9ECEE" w:val="clear"/>
+            <w:tcMar>
+              <w:top w:type="dxa" w:w="60"/>
+              <w:left w:type="dxa" w:w="100"/>
+              <w:bottom w:type="dxa" w:w="60"/>
+              <w:right w:type="dxa" w:w="100"/>
+            </w:tcMar>
+          </w:tcPr>
+          <w:p>
+            <w:pPr>
+              <w:spacing w:after="0" w:line="256"/>
+            </w:pPr>
+            <w:r>
+              <w:rPr>
+                <w:b/>
+                <w:bCs/>
+              </w:rPr>
+              <w:t xml:space="preserve">Verbatim evidence</w:t>
+            </w:r>
+          </w:p>
+        </w:tc>
+      </w:tr>
+      <w:tr>
+        <w:tc>
+          <w:tcPr>
+            <w:tcW w:type="dxa" w:w="2400"/>
+            <w:tcBorders>
+              <w:top w:val="single" w:color="B0B0B0" w:sz="1"/>
+              <w:left w:val="single" w:color="B0B0B0" w:sz="1"/>
+              <w:bottom w:val="single" w:color="B0B0B0" w:sz="1"/>
+              <w:right w:val="single" w:color="B0B0B0" w:sz="1"/>
+            </w:tcBorders>
+            <w:tcMar>
+              <w:top w:type="dxa" w:w="60"/>
+              <w:left w:type="dxa" w:w="100"/>
+              <w:bottom w:type="dxa" w:w="60"/>
+              <w:right w:type="dxa" w:w="100"/>
+            </w:tcMar>
+          </w:tcPr>
+          <w:p>
+            <w:pPr>
+              <w:spacing w:after="0" w:line="256"/>
+            </w:pPr>
+            <w:r>
+              <w:rPr>
+                <w:b/>
+                <w:bCs/>
+              </w:rPr>
+              <w:t xml:space="preserve">Self-worth basis</w:t>
+            </w:r>
+          </w:p>
+        </w:tc>
+        <w:tc>
+          <w:tcPr>
+            <w:tcW w:type="dxa" w:w="2050"/>
+            <w:tcBorders>
+              <w:top w:val="single" w:color="B0B0B0" w:sz="1"/>
+              <w:left w:val="single" w:color="B0B0B0" w:sz="1"/>
+              <w:bottom w:val="single" w:color="B0B0B0" w:sz="1"/>
+              <w:right w:val="single" w:color="B0B0B0" w:sz="1"/>
+            </w:tcBorders>
+            <w:tcMar>
+              <w:top w:type="dxa" w:w="60"/>
+              <w:left w:type="dxa" w:w="100"/>
+              <w:bottom w:type="dxa" w:w="60"/>
+              <w:right w:type="dxa" w:w="100"/>
+            </w:tcMar>
+          </w:tcPr>
+          <w:p>
+            <w:pPr>
+              <w:spacing w:after="0" w:line="256"/>
+            </w:pPr>
+            <w:r>
+              <w:rPr>
+                <w:b w:val="false"/>
+                <w:bCs w:val="false"/>
+              </w:rPr>
+              <w:t xml:space="preserve">Absolute, non-negotiable (NOT contingent)</w:t>
+            </w:r>
+          </w:p>
+        </w:tc>
+        <w:tc>
+          <w:tcPr>
+            <w:tcW w:type="dxa" w:w="1100"/>
+            <w:tcBorders>
+              <w:top w:val="single" w:color="B0B0B0" w:sz="1"/>
+              <w:left w:val="single" w:color="B0B0B0" w:sz="1"/>
+              <w:bottom w:val="single" w:color="B0B0B0" w:sz="1"/>
+              <w:right w:val="single" w:color="B0B0B0" w:sz="1"/>
+            </w:tcBorders>
+            <w:shd w:fill="E8F2E2" w:val="clear"/>
+            <w:tcMar>
+              <w:top w:type="dxa" w:w="60"/>
+              <w:left w:type="dxa" w:w="100"/>
+              <w:bottom w:type="dxa" w:w="60"/>
+              <w:right w:type="dxa" w:w="100"/>
+            </w:tcMar>
+          </w:tcPr>
+          <w:p>
+            <w:pPr>
+              <w:spacing w:after="0" w:line="256"/>
+            </w:pPr>
+            <w:r>
+              <w:rPr>
+                <w:b/>
+                <w:bCs/>
+              </w:rPr>
+              <w:t xml:space="preserve">LOCKED</w:t>
+            </w:r>
+          </w:p>
+        </w:tc>
+        <w:tc>
+          <w:tcPr>
+            <w:tcW w:type="dxa" w:w="3810"/>
+            <w:tcBorders>
+              <w:top w:val="single" w:color="B0B0B0" w:sz="1"/>
+              <w:left w:val="single" w:color="B0B0B0" w:sz="1"/>
+              <w:bottom w:val="single" w:color="B0B0B0" w:sz="1"/>
+              <w:right w:val="single" w:color="B0B0B0" w:sz="1"/>
+            </w:tcBorders>
+            <w:tcMar>
+              <w:top w:type="dxa" w:w="60"/>
+              <w:left w:type="dxa" w:w="100"/>
+              <w:bottom w:type="dxa" w:w="60"/>
+              <w:right w:type="dxa" w:w="100"/>
+            </w:tcMar>
+          </w:tcPr>
+          <w:p>
+            <w:pPr>
+              <w:spacing w:after="0" w:line="256"/>
+            </w:pPr>
+            <w:r>
+              <w:rPr>
+                <w:b w:val="false"/>
+                <w:bCs w:val="false"/>
+              </w:rPr>
+              <w:t xml:space="preserve">"absolute and non-negotiable." Resolves the open question: internal reference is a FOUNDATION, not compensation or armor.</w:t>
+            </w:r>
+          </w:p>
+        </w:tc>
+      </w:tr>
+      <w:tr>
+        <w:tc>
+          <w:tcPr>
+            <w:tcW w:type="dxa" w:w="2400"/>
+            <w:tcBorders>
+              <w:top w:val="single" w:color="B0B0B0" w:sz="1"/>
+              <w:left w:val="single" w:color="B0B0B0" w:sz="1"/>
+              <w:bottom w:val="single" w:color="B0B0B0" w:sz="1"/>
+              <w:right w:val="single" w:color="B0B0B0" w:sz="1"/>
+            </w:tcBorders>
+            <w:tcMar>
+              <w:top w:type="dxa" w:w="60"/>
+              <w:left w:type="dxa" w:w="100"/>
+              <w:bottom w:type="dxa" w:w="60"/>
+              <w:right w:type="dxa" w:w="100"/>
+            </w:tcMar>
+          </w:tcPr>
+          <w:p>
+            <w:pPr>
+              <w:spacing w:after="0" w:line="256"/>
+            </w:pPr>
+            <w:r>
+              <w:rPr>
+                <w:b/>
+                <w:bCs/>
+              </w:rPr>
+              <w:t xml:space="preserve">Worth-definition giver</w:t>
+            </w:r>
+          </w:p>
+        </w:tc>
+        <w:tc>
+          <w:tcPr>
+            <w:tcW w:type="dxa" w:w="2050"/>
+            <w:tcBorders>
+              <w:top w:val="single" w:color="B0B0B0" w:sz="1"/>
+              <w:left w:val="single" w:color="B0B0B0" w:sz="1"/>
+              <w:bottom w:val="single" w:color="B0B0B0" w:sz="1"/>
+              <w:right w:val="single" w:color="B0B0B0" w:sz="1"/>
+            </w:tcBorders>
+            <w:tcMar>
+              <w:top w:type="dxa" w:w="60"/>
+              <w:left w:type="dxa" w:w="100"/>
+              <w:bottom w:type="dxa" w:w="60"/>
+              <w:right w:type="dxa" w:w="100"/>
+            </w:tcMar>
+          </w:tcPr>
+          <w:p>
+            <w:pPr>
+              <w:spacing w:after="0" w:line="256"/>
+            </w:pPr>
+            <w:r>
+              <w:rPr>
+                <w:b w:val="false"/>
+                <w:bCs w:val="false"/>
+              </w:rPr>
+              <w:t xml:space="preserve">Mom and Dad</w:t>
+            </w:r>
+          </w:p>
+        </w:tc>
+        <w:tc>
+          <w:tcPr>
+            <w:tcW w:type="dxa" w:w="1100"/>
+            <w:tcBorders>
+              <w:top w:val="single" w:color="B0B0B0" w:sz="1"/>
+              <w:left w:val="single" w:color="B0B0B0" w:sz="1"/>
+              <w:bottom w:val="single" w:color="B0B0B0" w:sz="1"/>
+              <w:right w:val="single" w:color="B0B0B0" w:sz="1"/>
+            </w:tcBorders>
+            <w:shd w:fill="E8F2E2" w:val="clear"/>
+            <w:tcMar>
+              <w:top w:type="dxa" w:w="60"/>
+              <w:left w:type="dxa" w:w="100"/>
+              <w:bottom w:type="dxa" w:w="60"/>
+              <w:right w:type="dxa" w:w="100"/>
+            </w:tcMar>
+          </w:tcPr>
+          <w:p>
+            <w:pPr>
+              <w:spacing w:after="0" w:line="256"/>
+            </w:pPr>
+            <w:r>
+              <w:rPr>
+                <w:b/>
+                <w:bCs/>
+              </w:rPr>
+              <w:t xml:space="preserve">LOCKED</w:t>
+            </w:r>
+          </w:p>
+        </w:tc>
+        <w:tc>
+          <w:tcPr>
+            <w:tcW w:type="dxa" w:w="3810"/>
+            <w:tcBorders>
+              <w:top w:val="single" w:color="B0B0B0" w:sz="1"/>
+              <w:left w:val="single" w:color="B0B0B0" w:sz="1"/>
+              <w:bottom w:val="single" w:color="B0B0B0" w:sz="1"/>
+              <w:right w:val="single" w:color="B0B0B0" w:sz="1"/>
+            </w:tcBorders>
+            <w:tcMar>
+              <w:top w:type="dxa" w:w="60"/>
+              <w:left w:type="dxa" w:w="100"/>
+              <w:bottom w:type="dxa" w:w="60"/>
+              <w:right w:type="dxa" w:w="100"/>
+            </w:tcMar>
+          </w:tcPr>
+          <w:p>
+            <w:pPr>
+              <w:spacing w:after="0" w:line="256"/>
+            </w:pPr>
+            <w:r>
+              <w:rPr>
+                <w:b w:val="false"/>
+                <w:bCs w:val="false"/>
+              </w:rPr>
+              <w:t xml:space="preserve">"my mom and dad" — extends the father-dyad to include the mother for worth-definition.</w:t>
+            </w:r>
+          </w:p>
+        </w:tc>
+      </w:tr>
+      <w:tr>
+        <w:tc>
+          <w:tcPr>
+            <w:tcW w:type="dxa" w:w="2400"/>
+            <w:tcBorders>
+              <w:top w:val="single" w:color="B0B0B0" w:sz="1"/>
+              <w:left w:val="single" w:color="B0B0B0" w:sz="1"/>
+              <w:bottom w:val="single" w:color="B0B0B0" w:sz="1"/>
+              <w:right w:val="single" w:color="B0B0B0" w:sz="1"/>
+            </w:tcBorders>
+            <w:tcMar>
+              <w:top w:type="dxa" w:w="60"/>
+              <w:left w:type="dxa" w:w="100"/>
+              <w:bottom w:type="dxa" w:w="60"/>
+              <w:right w:type="dxa" w:w="100"/>
+            </w:tcMar>
+          </w:tcPr>
+          <w:p>
+            <w:pPr>
+              <w:spacing w:after="0" w:line="256"/>
+            </w:pPr>
+            <w:r>
+              <w:rPr>
+                <w:b/>
+                <w:bCs/>
+              </w:rPr>
+              <w:t xml:space="preserve">Work intention</w:t>
+            </w:r>
+          </w:p>
+        </w:tc>
+        <w:tc>
+          <w:tcPr>
+            <w:tcW w:type="dxa" w:w="2050"/>
+            <w:tcBorders>
+              <w:top w:val="single" w:color="B0B0B0" w:sz="1"/>
+              <w:left w:val="single" w:color="B0B0B0" w:sz="1"/>
+              <w:bottom w:val="single" w:color="B0B0B0" w:sz="1"/>
+              <w:right w:val="single" w:color="B0B0B0" w:sz="1"/>
+            </w:tcBorders>
+            <w:tcMar>
+              <w:top w:type="dxa" w:w="60"/>
+              <w:left w:type="dxa" w:w="100"/>
+              <w:bottom w:type="dxa" w:w="60"/>
+              <w:right w:type="dxa" w:w="100"/>
+            </w:tcMar>
+          </w:tcPr>
+          <w:p>
+            <w:pPr>
+              <w:spacing w:after="0" w:line="256"/>
+            </w:pPr>
+            <w:r>
+              <w:rPr>
+                <w:b w:val="false"/>
+                <w:bCs w:val="false"/>
+              </w:rPr>
+              <w:t xml:space="preserve">Contribution / saving others time + money</w:t>
+            </w:r>
+          </w:p>
+        </w:tc>
+        <w:tc>
+          <w:tcPr>
+            <w:tcW w:type="dxa" w:w="1100"/>
+            <w:tcBorders>
+              <w:top w:val="single" w:color="B0B0B0" w:sz="1"/>
+              <w:left w:val="single" w:color="B0B0B0" w:sz="1"/>
+              <w:bottom w:val="single" w:color="B0B0B0" w:sz="1"/>
+              <w:right w:val="single" w:color="B0B0B0" w:sz="1"/>
+            </w:tcBorders>
+            <w:shd w:fill="E8F2E2" w:val="clear"/>
+            <w:tcMar>
+              <w:top w:type="dxa" w:w="60"/>
+              <w:left w:type="dxa" w:w="100"/>
+              <w:bottom w:type="dxa" w:w="60"/>
+              <w:right w:type="dxa" w:w="100"/>
+            </w:tcMar>
+          </w:tcPr>
+          <w:p>
+            <w:pPr>
+              <w:spacing w:after="0" w:line="256"/>
+            </w:pPr>
+            <w:r>
+              <w:rPr>
+                <w:b/>
+                <w:bCs/>
+              </w:rPr>
+              <w:t xml:space="preserve">LOCKED</w:t>
+            </w:r>
+          </w:p>
+        </w:tc>
+        <w:tc>
+          <w:tcPr>
+            <w:tcW w:type="dxa" w:w="3810"/>
+            <w:tcBorders>
+              <w:top w:val="single" w:color="B0B0B0" w:sz="1"/>
+              <w:left w:val="single" w:color="B0B0B0" w:sz="1"/>
+              <w:bottom w:val="single" w:color="B0B0B0" w:sz="1"/>
+              <w:right w:val="single" w:color="B0B0B0" w:sz="1"/>
+            </w:tcBorders>
+            <w:tcMar>
+              <w:top w:type="dxa" w:w="60"/>
+              <w:left w:type="dxa" w:w="100"/>
+              <w:bottom w:type="dxa" w:w="60"/>
+              <w:right w:type="dxa" w:w="100"/>
+            </w:tcMar>
+          </w:tcPr>
+          <w:p>
+            <w:pPr>
+              <w:spacing w:after="0" w:line="256"/>
+            </w:pPr>
+            <w:r>
+              <w:rPr>
+                <w:b w:val="false"/>
+                <w:bCs w:val="false"/>
+              </w:rPr>
+              <w:t xml:space="preserve">Work = "contributing to others’ lives, saving time and money."</w:t>
+            </w:r>
+          </w:p>
+        </w:tc>
+      </w:tr>
+      <w:tr>
+        <w:tc>
+          <w:tcPr>
+            <w:tcW w:type="dxa" w:w="2400"/>
+            <w:tcBorders>
+              <w:top w:val="single" w:color="B0B0B0" w:sz="1"/>
+              <w:left w:val="single" w:color="B0B0B0" w:sz="1"/>
+              <w:bottom w:val="single" w:color="B0B0B0" w:sz="1"/>
+              <w:right w:val="single" w:color="B0B0B0" w:sz="1"/>
+            </w:tcBorders>
+            <w:tcMar>
+              <w:top w:type="dxa" w:w="60"/>
+              <w:left w:type="dxa" w:w="100"/>
+              <w:bottom w:type="dxa" w:w="60"/>
+              <w:right w:type="dxa" w:w="100"/>
+            </w:tcMar>
+          </w:tcPr>
+          <w:p>
+            <w:pPr>
+              <w:spacing w:after="0" w:line="256"/>
+            </w:pPr>
+            <w:r>
+              <w:rPr>
+                <w:b/>
+                <w:bCs/>
+              </w:rPr>
+              <w:t xml:space="preserve">Life intention</w:t>
+            </w:r>
+          </w:p>
+        </w:tc>
+        <w:tc>
+          <w:tcPr>
+            <w:tcW w:type="dxa" w:w="2050"/>
+            <w:tcBorders>
+              <w:top w:val="single" w:color="B0B0B0" w:sz="1"/>
+              <w:left w:val="single" w:color="B0B0B0" w:sz="1"/>
+              <w:bottom w:val="single" w:color="B0B0B0" w:sz="1"/>
+              <w:right w:val="single" w:color="B0B0B0" w:sz="1"/>
+            </w:tcBorders>
+            <w:tcMar>
+              <w:top w:type="dxa" w:w="60"/>
+              <w:left w:type="dxa" w:w="100"/>
+              <w:bottom w:type="dxa" w:w="60"/>
+              <w:right w:type="dxa" w:w="100"/>
+            </w:tcMar>
+          </w:tcPr>
+          <w:p>
+            <w:pPr>
+              <w:spacing w:after="0" w:line="256"/>
+            </w:pPr>
+            <w:r>
+              <w:rPr>
+                <w:b w:val="false"/>
+                <w:bCs w:val="false"/>
+              </w:rPr>
+              <w:t xml:space="preserve">Consciously authoring</w:t>
+            </w:r>
+          </w:p>
+        </w:tc>
+        <w:tc>
+          <w:tcPr>
+            <w:tcW w:type="dxa" w:w="1100"/>
+            <w:tcBorders>
+              <w:top w:val="single" w:color="B0B0B0" w:sz="1"/>
+              <w:left w:val="single" w:color="B0B0B0" w:sz="1"/>
+              <w:bottom w:val="single" w:color="B0B0B0" w:sz="1"/>
+              <w:right w:val="single" w:color="B0B0B0" w:sz="1"/>
+            </w:tcBorders>
+            <w:shd w:fill="E8F2E2" w:val="clear"/>
+            <w:tcMar>
+              <w:top w:type="dxa" w:w="60"/>
+              <w:left w:type="dxa" w:w="100"/>
+              <w:bottom w:type="dxa" w:w="60"/>
+              <w:right w:type="dxa" w:w="100"/>
+            </w:tcMar>
+          </w:tcPr>
+          <w:p>
+            <w:pPr>
+              <w:spacing w:after="0" w:line="256"/>
+            </w:pPr>
+            <w:r>
+              <w:rPr>
+                <w:b/>
+                <w:bCs/>
+              </w:rPr>
+              <w:t xml:space="preserve">LOCKED</w:t>
+            </w:r>
+          </w:p>
+        </w:tc>
+        <w:tc>
+          <w:tcPr>
+            <w:tcW w:type="dxa" w:w="3810"/>
+            <w:tcBorders>
+              <w:top w:val="single" w:color="B0B0B0" w:sz="1"/>
+              <w:left w:val="single" w:color="B0B0B0" w:sz="1"/>
+              <w:bottom w:val="single" w:color="B0B0B0" w:sz="1"/>
+              <w:right w:val="single" w:color="B0B0B0" w:sz="1"/>
+            </w:tcBorders>
+            <w:tcMar>
+              <w:top w:type="dxa" w:w="60"/>
+              <w:left w:type="dxa" w:w="100"/>
+              <w:bottom w:type="dxa" w:w="60"/>
+              <w:right w:type="dxa" w:w="100"/>
+            </w:tcMar>
+          </w:tcPr>
+          <w:p>
+            <w:pPr>
+              <w:spacing w:after="0" w:line="256"/>
+            </w:pPr>
+            <w:r>
+              <w:rPr>
+                <w:b w:val="false"/>
+                <w:bCs w:val="false"/>
+              </w:rPr>
+              <w:t xml:space="preserve">Life = "consciously authoring"; goals point to fulfillment.</w:t>
+            </w:r>
+          </w:p>
+        </w:tc>
+      </w:tr>
+      <w:tr>
+        <w:tc>
+          <w:tcPr>
+            <w:tcW w:type="dxa" w:w="2400"/>
+            <w:tcBorders>
+              <w:top w:val="single" w:color="B0B0B0" w:sz="1"/>
+              <w:left w:val="single" w:color="B0B0B0" w:sz="1"/>
+              <w:bottom w:val="single" w:color="B0B0B0" w:sz="1"/>
+              <w:right w:val="single" w:color="B0B0B0" w:sz="1"/>
+            </w:tcBorders>
+            <w:tcMar>
+              <w:top w:type="dxa" w:w="60"/>
+              <w:left w:type="dxa" w:w="100"/>
+              <w:bottom w:type="dxa" w:w="60"/>
+              <w:right w:type="dxa" w:w="100"/>
+            </w:tcMar>
+          </w:tcPr>
+          <w:p>
+            <w:pPr>
+              <w:spacing w:after="0" w:line="256"/>
+            </w:pPr>
+            <w:r>
+              <w:rPr>
+                <w:b/>
+                <w:bCs/>
+              </w:rPr>
+              <w:t xml:space="preserve">Engagement baseline</w:t>
+            </w:r>
+          </w:p>
+        </w:tc>
+        <w:tc>
+          <w:tcPr>
+            <w:tcW w:type="dxa" w:w="2050"/>
+            <w:tcBorders>
+              <w:top w:val="single" w:color="B0B0B0" w:sz="1"/>
+              <w:left w:val="single" w:color="B0B0B0" w:sz="1"/>
+              <w:bottom w:val="single" w:color="B0B0B0" w:sz="1"/>
+              <w:right w:val="single" w:color="B0B0B0" w:sz="1"/>
+            </w:tcBorders>
+            <w:tcMar>
+              <w:top w:type="dxa" w:w="60"/>
+              <w:left w:type="dxa" w:w="100"/>
+              <w:bottom w:type="dxa" w:w="60"/>
+              <w:right w:type="dxa" w:w="100"/>
+            </w:tcMar>
+          </w:tcPr>
+          <w:p>
+            <w:pPr>
+              <w:spacing w:after="0" w:line="256"/>
+            </w:pPr>
+            <w:r>
+              <w:rPr>
+                <w:b w:val="false"/>
+                <w:bCs w:val="false"/>
+              </w:rPr>
+              <w:t xml:space="preserve">No grey / no boredom</w:t>
+            </w:r>
+          </w:p>
+        </w:tc>
+        <w:tc>
+          <w:tcPr>
+            <w:tcW w:type="dxa" w:w="1100"/>
+            <w:tcBorders>
+              <w:top w:val="single" w:color="B0B0B0" w:sz="1"/>
+              <w:left w:val="single" w:color="B0B0B0" w:sz="1"/>
+              <w:bottom w:val="single" w:color="B0B0B0" w:sz="1"/>
+              <w:right w:val="single" w:color="B0B0B0" w:sz="1"/>
+            </w:tcBorders>
+            <w:shd w:fill="E8F2E2" w:val="clear"/>
+            <w:tcMar>
+              <w:top w:type="dxa" w:w="60"/>
+              <w:left w:type="dxa" w:w="100"/>
+              <w:bottom w:type="dxa" w:w="60"/>
+              <w:right w:type="dxa" w:w="100"/>
+            </w:tcMar>
+          </w:tcPr>
+          <w:p>
+            <w:pPr>
+              <w:spacing w:after="0" w:line="256"/>
+            </w:pPr>
+            <w:r>
+              <w:rPr>
+                <w:b/>
+                <w:bCs/>
+              </w:rPr>
+              <w:t xml:space="preserve">LOCKED</w:t>
+            </w:r>
+          </w:p>
+        </w:tc>
+        <w:tc>
+          <w:tcPr>
+            <w:tcW w:type="dxa" w:w="3810"/>
+            <w:tcBorders>
+              <w:top w:val="single" w:color="B0B0B0" w:sz="1"/>
+              <w:left w:val="single" w:color="B0B0B0" w:sz="1"/>
+              <w:bottom w:val="single" w:color="B0B0B0" w:sz="1"/>
+              <w:right w:val="single" w:color="B0B0B0" w:sz="1"/>
+            </w:tcBorders>
+            <w:tcMar>
+              <w:top w:type="dxa" w:w="60"/>
+              <w:left w:type="dxa" w:w="100"/>
+              <w:bottom w:type="dxa" w:w="60"/>
+              <w:right w:type="dxa" w:w="100"/>
+            </w:tcMar>
+          </w:tcPr>
+          <w:p>
+            <w:pPr>
+              <w:spacing w:after="0" w:line="256"/>
+            </w:pPr>
+            <w:r>
+              <w:rPr>
+                <w:b w:val="false"/>
+                <w:bCs w:val="false"/>
+              </w:rPr>
+              <w:t xml:space="preserve">No grey or boring feeling reported — "so much excitement."</w:t>
+            </w:r>
+          </w:p>
+        </w:tc>
+      </w:tr>
+    </w:tbl>
+    <w:p>
+      <w:pPr>
+        <w:spacing w:after="160"/>
+      </w:pPr>
+    </w:p>
+    <w:p>
+      <w:pPr>
+        <w:pStyle w:val="Heading2"/>
+        <w:spacing w:after="80" w:before="160"/>
+      </w:pPr>
+      <w:r>
+        <w:rPr>
+          <w:color w:val="20808D"/>
+        </w:rPr>
+        <w:t xml:space="preserve">Matrix 10 — State Optimization</w:t>
+      </w:r>
+    </w:p>
+    <w:p>
+      <w:pPr>
+        <w:spacing w:after="100" w:line="276"/>
+      </w:pPr>
+      <w:r>
+        <w:rPr>
+          <w:i/>
+          <w:iCs/>
+          <w:color w:val="7A7974"/>
+        </w:rPr>
+        <w:t xml:space="preserve">Boundaries, held paradox, and deliberate state-shifting.</w:t>
+      </w:r>
+    </w:p>
+    <w:tbl>
+      <w:tblPr>
+        <w:tblW w:type="dxa" w:w="9360"/>
+        <w:tblBorders>
+          <w:top w:val="single" w:color="auto" w:sz="4"/>
+          <w:left w:val="single" w:color="auto" w:sz="4"/>
+          <w:bottom w:val="single" w:color="auto" w:sz="4"/>
+          <w:right w:val="single" w:color="auto" w:sz="4"/>
+          <w:insideH w:val="single" w:color="auto" w:sz="4"/>
+          <w:insideV w:val="single" w:color="auto" w:sz="4"/>
+        </w:tblBorders>
+      </w:tblPr>
+      <w:tblGrid>
+        <w:gridCol w:w="2400"/>
+        <w:gridCol w:w="2050"/>
+        <w:gridCol w:w="1100"/>
+        <w:gridCol w:w="3810"/>
+      </w:tblGrid>
+      <w:tr>
+        <w:trPr>
+          <w:tblHeader/>
+        </w:trPr>
+        <w:tc>
+          <w:tcPr>
+            <w:tcW w:type="dxa" w:w="2400"/>
+            <w:tcBorders>
+              <w:top w:val="single" w:color="B0B0B0" w:sz="1"/>
+              <w:left w:val="single" w:color="B0B0B0" w:sz="1"/>
+              <w:bottom w:val="single" w:color="B0B0B0" w:sz="1"/>
+              <w:right w:val="single" w:color="B0B0B0" w:sz="1"/>
+            </w:tcBorders>
+            <w:shd w:fill="D9ECEE" w:val="clear"/>
+            <w:tcMar>
+              <w:top w:type="dxa" w:w="60"/>
+              <w:left w:type="dxa" w:w="100"/>
+              <w:bottom w:type="dxa" w:w="60"/>
+              <w:right w:type="dxa" w:w="100"/>
+            </w:tcMar>
+          </w:tcPr>
+          <w:p>
+            <w:pPr>
+              <w:spacing w:after="0" w:line="256"/>
+            </w:pPr>
+            <w:r>
+              <w:rPr>
+                <w:b/>
+                <w:bCs/>
+              </w:rPr>
+              <w:t xml:space="preserve">Meta-Program Axis</w:t>
+            </w:r>
+          </w:p>
+        </w:tc>
+        <w:tc>
+          <w:tcPr>
+            <w:tcW w:type="dxa" w:w="2050"/>
+            <w:tcBorders>
+              <w:top w:val="single" w:color="B0B0B0" w:sz="1"/>
+              <w:left w:val="single" w:color="B0B0B0" w:sz="1"/>
+              <w:bottom w:val="single" w:color="B0B0B0" w:sz="1"/>
+              <w:right w:val="single" w:color="B0B0B0" w:sz="1"/>
+            </w:tcBorders>
+            <w:shd w:fill="D9ECEE" w:val="clear"/>
+            <w:tcMar>
+              <w:top w:type="dxa" w:w="60"/>
+              <w:left w:type="dxa" w:w="100"/>
+              <w:bottom w:type="dxa" w:w="60"/>
+              <w:right w:type="dxa" w:w="100"/>
+            </w:tcMar>
+          </w:tcPr>
+          <w:p>
+            <w:pPr>
+              <w:spacing w:after="0" w:line="256"/>
+            </w:pPr>
+            <w:r>
+              <w:rPr>
+                <w:b/>
+                <w:bCs/>
+              </w:rPr>
+              <w:t xml:space="preserve">Reading</w:t>
+            </w:r>
+          </w:p>
+        </w:tc>
+        <w:tc>
+          <w:tcPr>
+            <w:tcW w:type="dxa" w:w="1100"/>
+            <w:tcBorders>
+              <w:top w:val="single" w:color="B0B0B0" w:sz="1"/>
+              <w:left w:val="single" w:color="B0B0B0" w:sz="1"/>
+              <w:bottom w:val="single" w:color="B0B0B0" w:sz="1"/>
+              <w:right w:val="single" w:color="B0B0B0" w:sz="1"/>
+            </w:tcBorders>
+            <w:shd w:fill="D9ECEE" w:val="clear"/>
+            <w:tcMar>
+              <w:top w:type="dxa" w:w="60"/>
+              <w:left w:type="dxa" w:w="100"/>
+              <w:bottom w:type="dxa" w:w="60"/>
+              <w:right w:type="dxa" w:w="100"/>
+            </w:tcMar>
+          </w:tcPr>
+          <w:p>
+            <w:pPr>
+              <w:spacing w:after="0" w:line="256"/>
+            </w:pPr>
+            <w:r>
+              <w:rPr>
+                <w:b/>
+                <w:bCs/>
+              </w:rPr>
+              <w:t xml:space="preserve">Status</w:t>
+            </w:r>
+          </w:p>
+        </w:tc>
+        <w:tc>
+          <w:tcPr>
+            <w:tcW w:type="dxa" w:w="3810"/>
+            <w:tcBorders>
+              <w:top w:val="single" w:color="B0B0B0" w:sz="1"/>
+              <w:left w:val="single" w:color="B0B0B0" w:sz="1"/>
+              <w:bottom w:val="single" w:color="B0B0B0" w:sz="1"/>
+              <w:right w:val="single" w:color="B0B0B0" w:sz="1"/>
+            </w:tcBorders>
+            <w:shd w:fill="D9ECEE" w:val="clear"/>
+            <w:tcMar>
+              <w:top w:type="dxa" w:w="60"/>
+              <w:left w:type="dxa" w:w="100"/>
+              <w:bottom w:type="dxa" w:w="60"/>
+              <w:right w:type="dxa" w:w="100"/>
+            </w:tcMar>
+          </w:tcPr>
+          <w:p>
+            <w:pPr>
+              <w:spacing w:after="0" w:line="256"/>
+            </w:pPr>
+            <w:r>
+              <w:rPr>
+                <w:b/>
+                <w:bCs/>
+              </w:rPr>
+              <w:t xml:space="preserve">Verbatim evidence</w:t>
+            </w:r>
+          </w:p>
+        </w:tc>
+      </w:tr>
+      <w:tr>
+        <w:tc>
+          <w:tcPr>
+            <w:tcW w:type="dxa" w:w="2400"/>
+            <w:tcBorders>
+              <w:top w:val="single" w:color="B0B0B0" w:sz="1"/>
+              <w:left w:val="single" w:color="B0B0B0" w:sz="1"/>
+              <w:bottom w:val="single" w:color="B0B0B0" w:sz="1"/>
+              <w:right w:val="single" w:color="B0B0B0" w:sz="1"/>
+            </w:tcBorders>
+            <w:tcMar>
+              <w:top w:type="dxa" w:w="60"/>
+              <w:left w:type="dxa" w:w="100"/>
+              <w:bottom w:type="dxa" w:w="60"/>
+              <w:right w:type="dxa" w:w="100"/>
+            </w:tcMar>
+          </w:tcPr>
+          <w:p>
+            <w:pPr>
+              <w:spacing w:after="0" w:line="256"/>
+            </w:pPr>
+            <w:r>
+              <w:rPr>
+                <w:b/>
+                <w:bCs/>
+              </w:rPr>
+              <w:t xml:space="preserve">Boundary mastery</w:t>
+            </w:r>
+          </w:p>
+        </w:tc>
+        <w:tc>
+          <w:tcPr>
+            <w:tcW w:type="dxa" w:w="2050"/>
+            <w:tcBorders>
+              <w:top w:val="single" w:color="B0B0B0" w:sz="1"/>
+              <w:left w:val="single" w:color="B0B0B0" w:sz="1"/>
+              <w:bottom w:val="single" w:color="B0B0B0" w:sz="1"/>
+              <w:right w:val="single" w:color="B0B0B0" w:sz="1"/>
+            </w:tcBorders>
+            <w:tcMar>
+              <w:top w:type="dxa" w:w="60"/>
+              <w:left w:type="dxa" w:w="100"/>
+              <w:bottom w:type="dxa" w:w="60"/>
+              <w:right w:type="dxa" w:w="100"/>
+            </w:tcMar>
+          </w:tcPr>
+          <w:p>
+            <w:pPr>
+              <w:spacing w:after="0" w:line="256"/>
+            </w:pPr>
+            <w:r>
+              <w:rPr>
+                <w:b w:val="false"/>
+                <w:bCs w:val="false"/>
+              </w:rPr>
+              <w:t xml:space="preserve">Strong</w:t>
+            </w:r>
+          </w:p>
+        </w:tc>
+        <w:tc>
+          <w:tcPr>
+            <w:tcW w:type="dxa" w:w="1100"/>
+            <w:tcBorders>
+              <w:top w:val="single" w:color="B0B0B0" w:sz="1"/>
+              <w:left w:val="single" w:color="B0B0B0" w:sz="1"/>
+              <w:bottom w:val="single" w:color="B0B0B0" w:sz="1"/>
+              <w:right w:val="single" w:color="B0B0B0" w:sz="1"/>
+            </w:tcBorders>
+            <w:shd w:fill="E8F2E2" w:val="clear"/>
+            <w:tcMar>
+              <w:top w:type="dxa" w:w="60"/>
+              <w:left w:type="dxa" w:w="100"/>
+              <w:bottom w:type="dxa" w:w="60"/>
+              <w:right w:type="dxa" w:w="100"/>
+            </w:tcMar>
+          </w:tcPr>
+          <w:p>
+            <w:pPr>
+              <w:spacing w:after="0" w:line="256"/>
+            </w:pPr>
+            <w:r>
+              <w:rPr>
+                <w:b/>
+                <w:bCs/>
+              </w:rPr>
+              <w:t xml:space="preserve">LOCKED</w:t>
+            </w:r>
+          </w:p>
+        </w:tc>
+        <w:tc>
+          <w:tcPr>
+            <w:tcW w:type="dxa" w:w="3810"/>
+            <w:tcBorders>
+              <w:top w:val="single" w:color="B0B0B0" w:sz="1"/>
+              <w:left w:val="single" w:color="B0B0B0" w:sz="1"/>
+              <w:bottom w:val="single" w:color="B0B0B0" w:sz="1"/>
+              <w:right w:val="single" w:color="B0B0B0" w:sz="1"/>
+            </w:tcBorders>
+            <w:tcMar>
+              <w:top w:type="dxa" w:w="60"/>
+              <w:left w:type="dxa" w:w="100"/>
+              <w:bottom w:type="dxa" w:w="60"/>
+              <w:right w:type="dxa" w:w="100"/>
+            </w:tcMar>
+          </w:tcPr>
+          <w:p>
+            <w:pPr>
+              <w:spacing w:after="0" w:line="256"/>
+            </w:pPr>
+            <w:r>
+              <w:rPr>
+                <w:b w:val="false"/>
+                <w:bCs w:val="false"/>
+              </w:rPr>
+              <w:t xml:space="preserve">Shields against gossip; a warm "no"; walks away to clear toxicity.</w:t>
+            </w:r>
+          </w:p>
+        </w:tc>
+      </w:tr>
+      <w:tr>
+        <w:tc>
+          <w:tcPr>
+            <w:tcW w:type="dxa" w:w="2400"/>
+            <w:tcBorders>
+              <w:top w:val="single" w:color="B0B0B0" w:sz="1"/>
+              <w:left w:val="single" w:color="B0B0B0" w:sz="1"/>
+              <w:bottom w:val="single" w:color="B0B0B0" w:sz="1"/>
+              <w:right w:val="single" w:color="B0B0B0" w:sz="1"/>
+            </w:tcBorders>
+            <w:tcMar>
+              <w:top w:type="dxa" w:w="60"/>
+              <w:left w:type="dxa" w:w="100"/>
+              <w:bottom w:type="dxa" w:w="60"/>
+              <w:right w:type="dxa" w:w="100"/>
+            </w:tcMar>
+          </w:tcPr>
+          <w:p>
+            <w:pPr>
+              <w:spacing w:after="0" w:line="256"/>
+            </w:pPr>
+            <w:r>
+              <w:rPr>
+                <w:b/>
+                <w:bCs/>
+              </w:rPr>
+              <w:t xml:space="preserve">Held paradox</w:t>
+            </w:r>
+          </w:p>
+        </w:tc>
+        <w:tc>
+          <w:tcPr>
+            <w:tcW w:type="dxa" w:w="2050"/>
+            <w:tcBorders>
+              <w:top w:val="single" w:color="B0B0B0" w:sz="1"/>
+              <w:left w:val="single" w:color="B0B0B0" w:sz="1"/>
+              <w:bottom w:val="single" w:color="B0B0B0" w:sz="1"/>
+              <w:right w:val="single" w:color="B0B0B0" w:sz="1"/>
+            </w:tcBorders>
+            <w:tcMar>
+              <w:top w:type="dxa" w:w="60"/>
+              <w:left w:type="dxa" w:w="100"/>
+              <w:bottom w:type="dxa" w:w="60"/>
+              <w:right w:type="dxa" w:w="100"/>
+            </w:tcMar>
+          </w:tcPr>
+          <w:p>
+            <w:pPr>
+              <w:spacing w:after="0" w:line="256"/>
+            </w:pPr>
+            <w:r>
+              <w:rPr>
+                <w:b w:val="false"/>
+                <w:bCs w:val="false"/>
+              </w:rPr>
+              <w:t xml:space="preserve">Self-love + operational excellence</w:t>
+            </w:r>
+          </w:p>
+        </w:tc>
+        <w:tc>
+          <w:tcPr>
+            <w:tcW w:type="dxa" w:w="1100"/>
+            <w:tcBorders>
+              <w:top w:val="single" w:color="B0B0B0" w:sz="1"/>
+              <w:left w:val="single" w:color="B0B0B0" w:sz="1"/>
+              <w:bottom w:val="single" w:color="B0B0B0" w:sz="1"/>
+              <w:right w:val="single" w:color="B0B0B0" w:sz="1"/>
+            </w:tcBorders>
+            <w:shd w:fill="E8F2E2" w:val="clear"/>
+            <w:tcMar>
+              <w:top w:type="dxa" w:w="60"/>
+              <w:left w:type="dxa" w:w="100"/>
+              <w:bottom w:type="dxa" w:w="60"/>
+              <w:right w:type="dxa" w:w="100"/>
+            </w:tcMar>
+          </w:tcPr>
+          <w:p>
+            <w:pPr>
+              <w:spacing w:after="0" w:line="256"/>
+            </w:pPr>
+            <w:r>
+              <w:rPr>
+                <w:b/>
+                <w:bCs/>
+              </w:rPr>
+              <w:t xml:space="preserve">LOCKED</w:t>
+            </w:r>
+          </w:p>
+        </w:tc>
+        <w:tc>
+          <w:tcPr>
+            <w:tcW w:type="dxa" w:w="3810"/>
+            <w:tcBorders>
+              <w:top w:val="single" w:color="B0B0B0" w:sz="1"/>
+              <w:left w:val="single" w:color="B0B0B0" w:sz="1"/>
+              <w:bottom w:val="single" w:color="B0B0B0" w:sz="1"/>
+              <w:right w:val="single" w:color="B0B0B0" w:sz="1"/>
+            </w:tcBorders>
+            <w:tcMar>
+              <w:top w:type="dxa" w:w="60"/>
+              <w:left w:type="dxa" w:w="100"/>
+              <w:bottom w:type="dxa" w:w="60"/>
+              <w:right w:type="dxa" w:w="100"/>
+            </w:tcMar>
+          </w:tcPr>
+          <w:p>
+            <w:pPr>
+              <w:spacing w:after="0" w:line="256"/>
+            </w:pPr>
+            <w:r>
+              <w:rPr>
+                <w:b w:val="false"/>
+                <w:bCs w:val="false"/>
+              </w:rPr>
+              <w:t xml:space="preserve">Holds "unconditional self-love" alongside "relentless operational excellence" simultaneously.</w:t>
+            </w:r>
+          </w:p>
+        </w:tc>
+      </w:tr>
+      <w:tr>
+        <w:tc>
+          <w:tcPr>
+            <w:tcW w:type="dxa" w:w="2400"/>
+            <w:tcBorders>
+              <w:top w:val="single" w:color="B0B0B0" w:sz="1"/>
+              <w:left w:val="single" w:color="B0B0B0" w:sz="1"/>
+              <w:bottom w:val="single" w:color="B0B0B0" w:sz="1"/>
+              <w:right w:val="single" w:color="B0B0B0" w:sz="1"/>
+            </w:tcBorders>
+            <w:tcMar>
+              <w:top w:type="dxa" w:w="60"/>
+              <w:left w:type="dxa" w:w="100"/>
+              <w:bottom w:type="dxa" w:w="60"/>
+              <w:right w:type="dxa" w:w="100"/>
+            </w:tcMar>
+          </w:tcPr>
+          <w:p>
+            <w:pPr>
+              <w:spacing w:after="0" w:line="256"/>
+            </w:pPr>
+            <w:r>
+              <w:rPr>
+                <w:b/>
+                <w:bCs/>
+              </w:rPr>
+              <w:t xml:space="preserve">State transform</w:t>
+            </w:r>
+          </w:p>
+        </w:tc>
+        <w:tc>
+          <w:tcPr>
+            <w:tcW w:type="dxa" w:w="2050"/>
+            <w:tcBorders>
+              <w:top w:val="single" w:color="B0B0B0" w:sz="1"/>
+              <w:left w:val="single" w:color="B0B0B0" w:sz="1"/>
+              <w:bottom w:val="single" w:color="B0B0B0" w:sz="1"/>
+              <w:right w:val="single" w:color="B0B0B0" w:sz="1"/>
+            </w:tcBorders>
+            <w:tcMar>
+              <w:top w:type="dxa" w:w="60"/>
+              <w:left w:type="dxa" w:w="100"/>
+              <w:bottom w:type="dxa" w:w="60"/>
+              <w:right w:type="dxa" w:w="100"/>
+            </w:tcMar>
+          </w:tcPr>
+          <w:p>
+            <w:pPr>
+              <w:spacing w:after="0" w:line="256"/>
+            </w:pPr>
+            <w:r>
+              <w:rPr>
+                <w:b w:val="false"/>
+                <w:bCs w:val="false"/>
+              </w:rPr>
+              <w:t xml:space="preserve">Fear → curiosity (confirmed)</w:t>
+            </w:r>
+          </w:p>
+        </w:tc>
+        <w:tc>
+          <w:tcPr>
+            <w:tcW w:type="dxa" w:w="1100"/>
+            <w:tcBorders>
+              <w:top w:val="single" w:color="B0B0B0" w:sz="1"/>
+              <w:left w:val="single" w:color="B0B0B0" w:sz="1"/>
+              <w:bottom w:val="single" w:color="B0B0B0" w:sz="1"/>
+              <w:right w:val="single" w:color="B0B0B0" w:sz="1"/>
+            </w:tcBorders>
+            <w:shd w:fill="E8F2E2" w:val="clear"/>
+            <w:tcMar>
+              <w:top w:type="dxa" w:w="60"/>
+              <w:left w:type="dxa" w:w="100"/>
+              <w:bottom w:type="dxa" w:w="60"/>
+              <w:right w:type="dxa" w:w="100"/>
+            </w:tcMar>
+          </w:tcPr>
+          <w:p>
+            <w:pPr>
+              <w:spacing w:after="0" w:line="256"/>
+            </w:pPr>
+            <w:r>
+              <w:rPr>
+                <w:b/>
+                <w:bCs/>
+              </w:rPr>
+              <w:t xml:space="preserve">LOCKED</w:t>
+            </w:r>
+          </w:p>
+        </w:tc>
+        <w:tc>
+          <w:tcPr>
+            <w:tcW w:type="dxa" w:w="3810"/>
+            <w:tcBorders>
+              <w:top w:val="single" w:color="B0B0B0" w:sz="1"/>
+              <w:left w:val="single" w:color="B0B0B0" w:sz="1"/>
+              <w:bottom w:val="single" w:color="B0B0B0" w:sz="1"/>
+              <w:right w:val="single" w:color="B0B0B0" w:sz="1"/>
+            </w:tcBorders>
+            <w:tcMar>
+              <w:top w:type="dxa" w:w="60"/>
+              <w:left w:type="dxa" w:w="100"/>
+              <w:bottom w:type="dxa" w:w="60"/>
+              <w:right w:type="dxa" w:w="100"/>
+            </w:tcMar>
+          </w:tcPr>
+          <w:p>
+            <w:pPr>
+              <w:spacing w:after="0" w:line="256"/>
+            </w:pPr>
+            <w:r>
+              <w:rPr>
+                <w:b w:val="false"/>
+                <w:bCs w:val="false"/>
+              </w:rPr>
+              <w:t xml:space="preserve">The fear→curiosity transform from Matrix 5 holds up under the optimization lens.</w:t>
             </w:r>
           </w:p>
         </w:tc>
@@ -6482,6 +10034,26 @@
     </w:p>
     <w:p>
       <w:pPr>
+        <w:pStyle w:val="ListParagraph"/>
+        <w:numPr>
+          <w:ilvl w:val="0"/>
+          <w:numId w:val="2"/>
+        </w:numPr>
+        <w:spacing w:after="80" w:line="276"/>
+      </w:pPr>
+      <w:r>
+        <w:rPr>
+          <w:b/>
+          <w:bCs/>
+        </w:rPr>
+        <w:t xml:space="preserve">Confrontation vs. peace-keeping. </w:t>
+      </w:r>
+      <w:r>
+        <w:t xml:space="preserve">Matrix 3 reads you as a confronter who "hashes it out" — yet Matrix 7 shows you "swallow to keep peace many times." The clearing-the-air instinct and the peace-keeping instinct share the same person; which fires appears to depend on whether the relationship is worth the rupture.</w:t>
+      </w:r>
+    </w:p>
+    <w:p>
+      <w:pPr>
         <w:pStyle w:val="Heading1"/>
         <w:spacing w:after="120" w:before="240"/>
       </w:pPr>
@@ -6579,10 +10151,30 @@
           <w:b/>
           <w:bCs/>
         </w:rPr>
-        <w:t xml:space="preserve">Matrices 6–10 (Q251–500). </w:t>
+        <w:t xml:space="preserve">Matrix 7 attachment items. </w:t>
       </w:r>
       <w:r>
-        <w:t xml:space="preserve">The back half of the instrument was never administered. Hall’s 60+ meta-programs are roughly half-mapped.</w:t>
+        <w:t xml:space="preserve">Several attachment-style questions were garbled in dictation and could not be bound — the conflict and power sub-axes are captured, attachment is not.</w:t>
+      </w:r>
+    </w:p>
+    <w:p>
+      <w:pPr>
+        <w:pStyle w:val="ListParagraph"/>
+        <w:numPr>
+          <w:ilvl w:val="0"/>
+          <w:numId w:val="2"/>
+        </w:numPr>
+        <w:spacing w:after="80" w:line="276"/>
+      </w:pPr>
+      <w:r>
+        <w:rPr>
+          <w:b/>
+          <w:bCs/>
+        </w:rPr>
+        <w:t xml:space="preserve">Matrix 8 — Linguistic / Mind-Lines (Q351–400). </w:t>
+      </w:r>
+      <w:r>
+        <w:t xml:space="preserve">The reframing-and-mind-lines matrix was never administered. Your power words, forbidden words, and signature phrases remain the single largest gap.</w:t>
       </w:r>
     </w:p>
     <w:p>

</xml_diff>